<commit_message>
stream api questions on Sat, Aug 29, 2026  12:55:44 AM
</commit_message>
<xml_diff>
--- a/Java/stream_api.docx
+++ b/Java/stream_api.docx
@@ -1,6 +1,6 @@
 
 <file path=word/document.xml><?xml version="1.0" encoding="utf-8"?>
-<w:document xmlns:wpc="http://schemas.microsoft.com/office/word/2010/wordprocessingCanvas" xmlns:cx="http://schemas.microsoft.com/office/drawing/2014/chartex" xmlns:cx1="http://schemas.microsoft.com/office/drawing/2015/9/8/chartex" xmlns:cx2="http://schemas.microsoft.com/office/drawing/2015/10/21/chartex" xmlns:cx3="http://schemas.microsoft.com/office/drawing/2016/5/9/chartex" xmlns:cx4="http://schemas.microsoft.com/office/drawing/2016/5/10/chartex" xmlns:cx5="http://schemas.microsoft.com/office/drawing/2016/5/11/chartex" xmlns:cx6="http://schemas.microsoft.com/office/drawing/2016/5/12/chartex" xmlns:cx7="http://schemas.microsoft.com/office/drawing/2016/5/13/chartex" xmlns:cx8="http://schemas.microsoft.com/office/drawing/2016/5/14/chartex" xmlns:mc="http://schemas.openxmlformats.org/markup-compatibility/2006" xmlns:m="http://schemas.openxmlformats.org/officeDocument/2006/math" xmlns:aink="http://schemas.microsoft.com/office/drawing/2016/ink" xmlns:am3d="http://schemas.microsoft.com/office/drawing/2017/model3d" xmlns:oel="http://schemas.microsoft.com/office/2019/extlst" xmlns:r="http://schemas.openxmlformats.org/officeDocument/2006/relationships" xmlns:wp14="http://schemas.microsoft.com/office/word/2010/wordprocessingDrawing" xmlns:wp="http://schemas.openxmlformats.org/drawingml/2006/wordprocessingDrawing" xmlns:wpg="http://schemas.microsoft.com/office/word/2010/wordprocessingGroup" xmlns:wpi="http://schemas.microsoft.com/office/word/2010/wordprocessingInk" xmlns:wps="http://schemas.microsoft.com/office/word/2010/wordprocessingShape" xmlns:o="urn:schemas-microsoft-com:office:office" xmlns:v="urn:schemas-microsoft-com:vml" xmlns:w10="urn:schemas-microsoft-com:office:word" xmlns:w="http://schemas.openxmlformats.org/wordprocessingml/2006/main" xmlns:w14="http://schemas.microsoft.com/office/word/2010/wordml" xmlns:w15="http://schemas.microsoft.com/office/word/2012/wordml" xmlns:w16cex="http://schemas.microsoft.com/office/word/2018/wordml/cex" xmlns:w16cid="http://schemas.microsoft.com/office/word/2016/wordml/cid" xmlns:w16="http://schemas.microsoft.com/office/word/2018/wordml" xmlns:w16sdtdh="http://schemas.microsoft.com/office/word/2020/wordml/sdtdatahash" xmlns:w16sdtfl="http://schemas.microsoft.com/office/word/2024/wordml/sdtformatlock" xmlns:w16se="http://schemas.microsoft.com/office/word/2015/wordml/symex" xmlns:w16du="http://schemas.microsoft.com/office/word/2023/wordml/word16du" xmlns:wne="http://schemas.microsoft.com/office/word/2006/wordml" mc:Ignorable="w14 w15 w16se w16cid w16 w16cex w16sdtdh w16sdtfl w16du wp14">
+<w:document xmlns:wpc="http://schemas.microsoft.com/office/word/2010/wordprocessingCanvas" xmlns:cx="http://schemas.microsoft.com/office/drawing/2014/chartex" xmlns:cx1="http://schemas.microsoft.com/office/drawing/2015/9/8/chartex" xmlns:cx2="http://schemas.microsoft.com/office/drawing/2015/10/21/chartex" xmlns:cx3="http://schemas.microsoft.com/office/drawing/2016/5/9/chartex" xmlns:cx4="http://schemas.microsoft.com/office/drawing/2016/5/10/chartex" xmlns:cx5="http://schemas.microsoft.com/office/drawing/2016/5/11/chartex" xmlns:cx6="http://schemas.microsoft.com/office/drawing/2016/5/12/chartex" xmlns:cx7="http://schemas.microsoft.com/office/drawing/2016/5/13/chartex" xmlns:cx8="http://schemas.microsoft.com/office/drawing/2016/5/14/chartex" xmlns:mc="http://schemas.openxmlformats.org/markup-compatibility/2006" xmlns:aink="http://schemas.microsoft.com/office/drawing/2016/ink" xmlns:am3d="http://schemas.microsoft.com/office/drawing/2017/model3d" xmlns:o="urn:schemas-microsoft-com:office:office" xmlns:oel="http://schemas.microsoft.com/office/2019/extlst" xmlns:r="http://schemas.openxmlformats.org/officeDocument/2006/relationships" xmlns:m="http://schemas.openxmlformats.org/officeDocument/2006/math" xmlns:v="urn:schemas-microsoft-com:vml" xmlns:wp14="http://schemas.microsoft.com/office/word/2010/wordprocessingDrawing" xmlns:wp="http://schemas.openxmlformats.org/drawingml/2006/wordprocessingDrawing" xmlns:w10="urn:schemas-microsoft-com:office:word" xmlns:w="http://schemas.openxmlformats.org/wordprocessingml/2006/main" xmlns:w14="http://schemas.microsoft.com/office/word/2010/wordml" xmlns:w15="http://schemas.microsoft.com/office/word/2012/wordml" xmlns:w16cei="http://schemas.microsoft.com/office/word/2026/wordml/cei" xmlns:w16cex="http://schemas.microsoft.com/office/word/2018/wordml/cex" xmlns:w16cid="http://schemas.microsoft.com/office/word/2016/wordml/cid" xmlns:w16="http://schemas.microsoft.com/office/word/2018/wordml" xmlns:w16du="http://schemas.microsoft.com/office/word/2023/wordml/word16du" xmlns:w16sdtdh="http://schemas.microsoft.com/office/word/2020/wordml/sdtdatahash" xmlns:w16sdtfl="http://schemas.microsoft.com/office/word/2024/wordml/sdtformatlock" xmlns:w16se="http://schemas.microsoft.com/office/word/2015/wordml/symex" xmlns:wpg="http://schemas.microsoft.com/office/word/2010/wordprocessingGroup" xmlns:wpi="http://schemas.microsoft.com/office/word/2010/wordprocessingInk" xmlns:wne="http://schemas.microsoft.com/office/word/2006/wordml" xmlns:wps="http://schemas.microsoft.com/office/word/2010/wordprocessingShape" mc:Ignorable="w14 w15 w16se w16cid w16 w16cex w16sdtdh w16sdtfl w16du wp14">
   <w:body>
     <w:p>
       <w:pPr>
@@ -5380,6 +5380,7 @@
         <w:rPr>
           <w:lang w:val="en-US"/>
         </w:rPr>
+        <w:lastRenderedPageBreak/>
         <w:t>custom sorting</w:t>
       </w:r>
     </w:p>
@@ -7010,6 +7011,7 @@
         <w:rPr>
           <w:lang w:val="en-US"/>
         </w:rPr>
+        <w:lastRenderedPageBreak/>
         <w:t xml:space="preserve">The </w:t>
       </w:r>
       <w:proofErr w:type="gramStart"/>
@@ -8275,6 +8277,7 @@
           <w:rFonts w:ascii="Times New Roman" w:hAnsi="Times New Roman" w:cs="Times New Roman"/>
           <w:kern w:val="0"/>
         </w:rPr>
+        <w:lastRenderedPageBreak/>
         <w:t xml:space="preserve">        </w:t>
       </w:r>
       <w:proofErr w:type="spellStart"/>
@@ -8405,7 +8408,6 @@
         <w:rPr>
           <w:lang w:val="en-US"/>
         </w:rPr>
-        <w:lastRenderedPageBreak/>
         <w:t>Filtering apple</w:t>
       </w:r>
     </w:p>
@@ -9290,6 +9292,7 @@
         <w:rPr>
           <w:lang w:val="en-US"/>
         </w:rPr>
+        <w:lastRenderedPageBreak/>
         <w:t xml:space="preserve">The </w:t>
       </w:r>
       <w:proofErr w:type="gramStart"/>
@@ -9317,7 +9320,6 @@
         <w:rPr>
           <w:lang w:val="en-US"/>
         </w:rPr>
-        <w:lastRenderedPageBreak/>
         <w:t xml:space="preserve">It takes a binary operator as a parameter that specifies how to combine the elements of the stream. The </w:t>
       </w:r>
       <w:proofErr w:type="gramStart"/>
@@ -10252,7 +10254,6 @@
         <w:rPr>
           <w:lang w:val="en-US"/>
         </w:rPr>
-        <w:lastRenderedPageBreak/>
         <w:t>skip(</w:t>
       </w:r>
       <w:proofErr w:type="gramEnd"/>
@@ -12405,13 +12406,27 @@
         <w:rPr>
           <w:lang w:val="en-US"/>
         </w:rPr>
-        <w:t xml:space="preserve">. It returns a Map object where the keys are the </w:t>
+        <w:t xml:space="preserve">. It </w:t>
       </w:r>
       <w:proofErr w:type="gramStart"/>
       <w:r>
         <w:rPr>
           <w:lang w:val="en-US"/>
         </w:rPr>
+        <w:t>returns</w:t>
+      </w:r>
+      <w:proofErr w:type="gramEnd"/>
+      <w:r>
+        <w:rPr>
+          <w:lang w:val="en-US"/>
+        </w:rPr>
+        <w:t xml:space="preserve"> a Map object where the keys are the </w:t>
+      </w:r>
+      <w:proofErr w:type="gramStart"/>
+      <w:r>
+        <w:rPr>
+          <w:lang w:val="en-US"/>
+        </w:rPr>
         <w:t>groups</w:t>
       </w:r>
       <w:proofErr w:type="gramEnd"/>
@@ -12432,6 +12447,7 @@
         <w:rPr>
           <w:lang w:val="en-US"/>
         </w:rPr>
+        <w:lastRenderedPageBreak/>
         <w:t xml:space="preserve">The </w:t>
       </w:r>
       <w:proofErr w:type="spellStart"/>
@@ -13807,6 +13823,7 @@
         <w:rPr>
           <w:lang w:val="en-US"/>
         </w:rPr>
+        <w:lastRenderedPageBreak/>
         <w:t xml:space="preserve">Questions </w:t>
       </w:r>
     </w:p>
@@ -13835,18 +13852,10 @@
         <w:rPr>
           <w:color w:val="0F0F0F"/>
         </w:rPr>
-        <w:lastRenderedPageBreak/>
         <w:t xml:space="preserve">Longest String </w:t>
       </w:r>
     </w:p>
     <w:p>
-      <w:pPr>
-        <w:pStyle w:val="Heading2"/>
-        <w:numPr>
-          <w:ilvl w:val="0"/>
-          <w:numId w:val="0"/>
-        </w:numPr>
-      </w:pPr>
       <w:r>
         <w:t>You are given an array of strings and must identify the string with the </w:t>
       </w:r>
@@ -14439,6 +14448,404 @@
       </w:r>
     </w:p>
     <w:p/>
+    <w:p>
+      <w:pPr>
+        <w:pStyle w:val="Heading2"/>
+      </w:pPr>
+      <w:r>
+        <w:t>Given a string like this "</w:t>
+      </w:r>
+      <w:proofErr w:type="spellStart"/>
+      <w:r>
+        <w:t>aaabbbbcc</w:t>
+      </w:r>
+      <w:proofErr w:type="spellEnd"/>
+      <w:r>
+        <w:t>”,</w:t>
+      </w:r>
+      <w:r>
+        <w:t xml:space="preserve"> need to output "a3b4c2"</w:t>
+      </w:r>
+      <w:r>
+        <w:t>.</w:t>
+      </w:r>
+    </w:p>
+    <w:p/>
+    <w:p>
+      <w:r>
+        <w:t xml:space="preserve">        String str = "</w:t>
+      </w:r>
+      <w:proofErr w:type="spellStart"/>
+      <w:r>
+        <w:t>aaabbbbcc</w:t>
+      </w:r>
+      <w:proofErr w:type="spellEnd"/>
+      <w:proofErr w:type="gramStart"/>
+      <w:r>
+        <w:t>" ;</w:t>
+      </w:r>
+      <w:proofErr w:type="gramEnd"/>
+      <w:r>
+        <w:t xml:space="preserve"> </w:t>
+      </w:r>
+      <w:r>
+        <w:br/>
+      </w:r>
+      <w:r>
+        <w:br/>
+        <w:t xml:space="preserve">        Map&lt;</w:t>
+      </w:r>
+      <w:proofErr w:type="gramStart"/>
+      <w:r>
+        <w:t>Character ,</w:t>
+      </w:r>
+      <w:proofErr w:type="gramEnd"/>
+      <w:r>
+        <w:t xml:space="preserve"> </w:t>
+      </w:r>
+      <w:proofErr w:type="gramStart"/>
+      <w:r>
+        <w:t>Long</w:t>
+      </w:r>
+      <w:proofErr w:type="gramEnd"/>
+      <w:r>
+        <w:t xml:space="preserve"> &gt; map =</w:t>
+      </w:r>
+      <w:r>
+        <w:br/>
+        <w:t xml:space="preserve">        str</w:t>
+      </w:r>
+      <w:r>
+        <w:br/>
+        <w:t xml:space="preserve">      </w:t>
+      </w:r>
+      <w:proofErr w:type="gramStart"/>
+      <w:r>
+        <w:t xml:space="preserve">  .chars</w:t>
+      </w:r>
+      <w:proofErr w:type="gramEnd"/>
+      <w:r>
+        <w:t>()</w:t>
+      </w:r>
+      <w:r>
+        <w:br/>
+        <w:t xml:space="preserve">      </w:t>
+      </w:r>
+      <w:proofErr w:type="gramStart"/>
+      <w:r>
+        <w:t xml:space="preserve">  .</w:t>
+      </w:r>
+      <w:proofErr w:type="spellStart"/>
+      <w:r>
+        <w:t>mapToObj</w:t>
+      </w:r>
+      <w:proofErr w:type="spellEnd"/>
+      <w:proofErr w:type="gramEnd"/>
+      <w:r>
+        <w:t>(</w:t>
+      </w:r>
+      <w:proofErr w:type="spellStart"/>
+      <w:r>
+        <w:t>i</w:t>
+      </w:r>
+      <w:proofErr w:type="spellEnd"/>
+      <w:r>
+        <w:t xml:space="preserve"> -&gt; (</w:t>
+      </w:r>
+      <w:r>
+        <w:rPr>
+          <w:i/>
+          <w:iCs/>
+        </w:rPr>
+        <w:t>char</w:t>
+      </w:r>
+      <w:r>
+        <w:t>)</w:t>
+      </w:r>
+      <w:proofErr w:type="spellStart"/>
+      <w:r>
+        <w:t>i</w:t>
+      </w:r>
+      <w:proofErr w:type="spellEnd"/>
+      <w:r>
+        <w:t>)</w:t>
+      </w:r>
+      <w:r>
+        <w:br/>
+        <w:t xml:space="preserve">      </w:t>
+      </w:r>
+      <w:proofErr w:type="gramStart"/>
+      <w:r>
+        <w:t xml:space="preserve">  .collect</w:t>
+      </w:r>
+      <w:proofErr w:type="gramEnd"/>
+      <w:r>
+        <w:t>(</w:t>
+      </w:r>
+      <w:r>
+        <w:br/>
+        <w:t xml:space="preserve">            </w:t>
+      </w:r>
+      <w:proofErr w:type="spellStart"/>
+      <w:r>
+        <w:t>Collectors.groupingBy</w:t>
+      </w:r>
+      <w:proofErr w:type="spellEnd"/>
+      <w:r>
+        <w:t xml:space="preserve"> (</w:t>
+      </w:r>
+      <w:r>
+        <w:br/>
+        <w:t xml:space="preserve">                </w:t>
+      </w:r>
+      <w:proofErr w:type="spellStart"/>
+      <w:r>
+        <w:t>Function.identity</w:t>
+      </w:r>
+      <w:proofErr w:type="spellEnd"/>
+      <w:r>
+        <w:t>(</w:t>
+      </w:r>
+      <w:proofErr w:type="gramStart"/>
+      <w:r>
+        <w:t>) ,</w:t>
+      </w:r>
+      <w:proofErr w:type="gramEnd"/>
+      <w:r>
+        <w:br/>
+        <w:t xml:space="preserve">                </w:t>
+      </w:r>
+      <w:proofErr w:type="spellStart"/>
+      <w:proofErr w:type="gramStart"/>
+      <w:r>
+        <w:t>LinkedHashMap</w:t>
+      </w:r>
+      <w:proofErr w:type="spellEnd"/>
+      <w:r>
+        <w:t>::new ,</w:t>
+      </w:r>
+      <w:proofErr w:type="gramEnd"/>
+      <w:r>
+        <w:br/>
+        <w:t xml:space="preserve">                </w:t>
+      </w:r>
+      <w:proofErr w:type="spellStart"/>
+      <w:r>
+        <w:t>Collectors.counting</w:t>
+      </w:r>
+      <w:proofErr w:type="spellEnd"/>
+      <w:r>
+        <w:t xml:space="preserve">() </w:t>
+      </w:r>
+      <w:r>
+        <w:br/>
+        <w:t xml:space="preserve">          </w:t>
+      </w:r>
+      <w:proofErr w:type="gramStart"/>
+      <w:r>
+        <w:t xml:space="preserve">  )</w:t>
+      </w:r>
+      <w:proofErr w:type="gramEnd"/>
+      <w:r>
+        <w:br/>
+        <w:t xml:space="preserve">        );</w:t>
+      </w:r>
+      <w:r>
+        <w:br/>
+      </w:r>
+      <w:r>
+        <w:br/>
+        <w:t xml:space="preserve">        </w:t>
+      </w:r>
+      <w:proofErr w:type="spellStart"/>
+      <w:proofErr w:type="gramStart"/>
+      <w:r>
+        <w:t>out.println</w:t>
+      </w:r>
+      <w:proofErr w:type="spellEnd"/>
+      <w:proofErr w:type="gramEnd"/>
+      <w:r>
+        <w:t>(map);</w:t>
+      </w:r>
+      <w:r>
+        <w:br/>
+      </w:r>
+    </w:p>
+    <w:p/>
+    <w:p/>
+    <w:p>
+      <w:r>
+        <w:lastRenderedPageBreak/>
+        <w:br/>
+        <w:t xml:space="preserve">        String result =</w:t>
+      </w:r>
+      <w:r>
+        <w:br/>
+        <w:t xml:space="preserve">        map</w:t>
+      </w:r>
+      <w:r>
+        <w:br/>
+        <w:t xml:space="preserve">      </w:t>
+      </w:r>
+      <w:proofErr w:type="gramStart"/>
+      <w:r>
+        <w:t xml:space="preserve">  .</w:t>
+      </w:r>
+      <w:proofErr w:type="spellStart"/>
+      <w:r>
+        <w:t>entrySet</w:t>
+      </w:r>
+      <w:proofErr w:type="spellEnd"/>
+      <w:proofErr w:type="gramEnd"/>
+      <w:r>
+        <w:t>()</w:t>
+      </w:r>
+      <w:r>
+        <w:br/>
+        <w:t xml:space="preserve">      </w:t>
+      </w:r>
+      <w:proofErr w:type="gramStart"/>
+      <w:r>
+        <w:t xml:space="preserve">  .stream</w:t>
+      </w:r>
+      <w:proofErr w:type="gramEnd"/>
+      <w:r>
+        <w:t>()</w:t>
+      </w:r>
+      <w:r>
+        <w:br/>
+        <w:t xml:space="preserve">      </w:t>
+      </w:r>
+      <w:proofErr w:type="gramStart"/>
+      <w:r>
+        <w:t xml:space="preserve">  .map( entry</w:t>
+      </w:r>
+      <w:proofErr w:type="gramEnd"/>
+      <w:r>
+        <w:t xml:space="preserve"> -&gt; </w:t>
+      </w:r>
+      <w:proofErr w:type="spellStart"/>
+      <w:proofErr w:type="gramStart"/>
+      <w:r>
+        <w:t>entry.getKey</w:t>
+      </w:r>
+      <w:proofErr w:type="spellEnd"/>
+      <w:proofErr w:type="gramEnd"/>
+      <w:r>
+        <w:t xml:space="preserve">() + </w:t>
+      </w:r>
+      <w:proofErr w:type="spellStart"/>
+      <w:r>
+        <w:t>String.valueOf</w:t>
+      </w:r>
+      <w:proofErr w:type="spellEnd"/>
+      <w:r>
+        <w:t>(</w:t>
+      </w:r>
+      <w:proofErr w:type="spellStart"/>
+      <w:proofErr w:type="gramStart"/>
+      <w:r>
+        <w:t>entry.getValue</w:t>
+      </w:r>
+      <w:proofErr w:type="spellEnd"/>
+      <w:proofErr w:type="gramEnd"/>
+      <w:r>
+        <w:t>()</w:t>
+      </w:r>
+      <w:proofErr w:type="gramStart"/>
+      <w:r>
+        <w:t>) )</w:t>
+      </w:r>
+      <w:proofErr w:type="gramEnd"/>
+      <w:r>
+        <w:br/>
+        <w:t xml:space="preserve">      </w:t>
+      </w:r>
+      <w:proofErr w:type="gramStart"/>
+      <w:r>
+        <w:t xml:space="preserve">  .collect</w:t>
+      </w:r>
+      <w:proofErr w:type="gramEnd"/>
+      <w:r>
+        <w:t>(</w:t>
+      </w:r>
+      <w:r>
+        <w:br/>
+        <w:t xml:space="preserve">            </w:t>
+      </w:r>
+      <w:proofErr w:type="gramStart"/>
+      <w:r>
+        <w:t>StringBuilder::new ,</w:t>
+      </w:r>
+      <w:proofErr w:type="gramEnd"/>
+      <w:r>
+        <w:t xml:space="preserve"> </w:t>
+      </w:r>
+      <w:r>
+        <w:br/>
+        <w:t xml:space="preserve">            </w:t>
+      </w:r>
+      <w:proofErr w:type="gramStart"/>
+      <w:r>
+        <w:t>StringBuilder::append ,</w:t>
+      </w:r>
+      <w:proofErr w:type="gramEnd"/>
+      <w:r>
+        <w:br/>
+        <w:t xml:space="preserve">            </w:t>
+      </w:r>
+      <w:proofErr w:type="gramStart"/>
+      <w:r>
+        <w:t>StringBuilder::</w:t>
+      </w:r>
+      <w:proofErr w:type="gramEnd"/>
+      <w:r>
+        <w:t>append</w:t>
+      </w:r>
+      <w:r>
+        <w:br/>
+        <w:t xml:space="preserve">      </w:t>
+      </w:r>
+      <w:proofErr w:type="gramStart"/>
+      <w:r>
+        <w:t xml:space="preserve">  )</w:t>
+      </w:r>
+      <w:proofErr w:type="gramEnd"/>
+      <w:r>
+        <w:br/>
+        <w:t xml:space="preserve">      </w:t>
+      </w:r>
+      <w:proofErr w:type="gramStart"/>
+      <w:r>
+        <w:t xml:space="preserve">  .</w:t>
+      </w:r>
+      <w:proofErr w:type="spellStart"/>
+      <w:r>
+        <w:t>toString</w:t>
+      </w:r>
+      <w:proofErr w:type="spellEnd"/>
+      <w:proofErr w:type="gramEnd"/>
+      <w:r>
+        <w:t>();</w:t>
+      </w:r>
+      <w:r>
+        <w:br/>
+      </w:r>
+      <w:r>
+        <w:br/>
+        <w:t xml:space="preserve">        </w:t>
+      </w:r>
+      <w:proofErr w:type="spellStart"/>
+      <w:proofErr w:type="gramStart"/>
+      <w:r>
+        <w:t>out.println</w:t>
+      </w:r>
+      <w:proofErr w:type="spellEnd"/>
+      <w:proofErr w:type="gramEnd"/>
+      <w:r>
+        <w:t>(result);</w:t>
+      </w:r>
+    </w:p>
     <w:p/>
     <w:p>
       <w:pPr>
@@ -15947,13 +16354,6 @@
     </w:p>
     <w:p>
       <w:pPr>
-        <w:rPr>
-          <w:lang w:val="en-US"/>
-        </w:rPr>
-      </w:pPr>
-    </w:p>
-    <w:p>
-      <w:pPr>
         <w:autoSpaceDE w:val="0"/>
         <w:autoSpaceDN w:val="0"/>
         <w:adjustRightInd w:val="0"/>
@@ -15968,38 +16368,55 @@
           <w:rFonts w:ascii="Times New Roman" w:hAnsi="Times New Roman" w:cs="Times New Roman"/>
           <w:kern w:val="0"/>
         </w:rPr>
-        <w:t xml:space="preserve">       String input </w:t>
-      </w:r>
-      <w:r>
-        <w:rPr>
-          <w:rFonts w:ascii="Times New Roman" w:hAnsi="Times New Roman" w:cs="Times New Roman"/>
-          <w:color w:val="666666"/>
-          <w:kern w:val="0"/>
-        </w:rPr>
-        <w:t>=</w:t>
-      </w:r>
-      <w:r>
-        <w:rPr>
-          <w:rFonts w:ascii="Times New Roman" w:hAnsi="Times New Roman" w:cs="Times New Roman"/>
-          <w:kern w:val="0"/>
-        </w:rPr>
-        <w:t xml:space="preserve"> </w:t>
-      </w:r>
-      <w:r>
-        <w:rPr>
-          <w:rFonts w:ascii="Times New Roman" w:hAnsi="Times New Roman" w:cs="Times New Roman"/>
-          <w:color w:val="BA2121"/>
-          <w:kern w:val="0"/>
-        </w:rPr>
-        <w:t>"this moment this moment take this"</w:t>
-      </w:r>
-      <w:r>
-        <w:rPr>
-          <w:rFonts w:ascii="Times New Roman" w:hAnsi="Times New Roman" w:cs="Times New Roman"/>
-          <w:color w:val="666666"/>
-          <w:kern w:val="0"/>
-        </w:rPr>
-        <w:t>;</w:t>
+        <w:t xml:space="preserve">        Map&lt;</w:t>
+      </w:r>
+      <w:proofErr w:type="gramStart"/>
+      <w:r>
+        <w:rPr>
+          <w:rFonts w:ascii="Times New Roman" w:hAnsi="Times New Roman" w:cs="Times New Roman"/>
+          <w:kern w:val="0"/>
+        </w:rPr>
+        <w:t>String ,</w:t>
+      </w:r>
+      <w:proofErr w:type="gramEnd"/>
+      <w:r>
+        <w:rPr>
+          <w:rFonts w:ascii="Times New Roman" w:hAnsi="Times New Roman" w:cs="Times New Roman"/>
+          <w:kern w:val="0"/>
+        </w:rPr>
+        <w:t xml:space="preserve"> </w:t>
+      </w:r>
+      <w:proofErr w:type="gramStart"/>
+      <w:r>
+        <w:rPr>
+          <w:rFonts w:ascii="Times New Roman" w:hAnsi="Times New Roman" w:cs="Times New Roman"/>
+          <w:kern w:val="0"/>
+        </w:rPr>
+        <w:t>Long</w:t>
+      </w:r>
+      <w:proofErr w:type="gramEnd"/>
+      <w:r>
+        <w:rPr>
+          <w:rFonts w:ascii="Times New Roman" w:hAnsi="Times New Roman" w:cs="Times New Roman"/>
+          <w:kern w:val="0"/>
+        </w:rPr>
+        <w:t xml:space="preserve"> &gt; </w:t>
+      </w:r>
+      <w:proofErr w:type="spellStart"/>
+      <w:r>
+        <w:rPr>
+          <w:rFonts w:ascii="Times New Roman" w:hAnsi="Times New Roman" w:cs="Times New Roman"/>
+          <w:kern w:val="0"/>
+        </w:rPr>
+        <w:t>fmap</w:t>
+      </w:r>
+      <w:proofErr w:type="spellEnd"/>
+      <w:r>
+        <w:rPr>
+          <w:rFonts w:ascii="Times New Roman" w:hAnsi="Times New Roman" w:cs="Times New Roman"/>
+          <w:kern w:val="0"/>
+        </w:rPr>
+        <w:t xml:space="preserve"> =</w:t>
       </w:r>
     </w:p>
     <w:p>
@@ -16013,6 +16430,13 @@
           <w:kern w:val="0"/>
         </w:rPr>
       </w:pPr>
+      <w:r>
+        <w:rPr>
+          <w:rFonts w:ascii="Times New Roman" w:hAnsi="Times New Roman" w:cs="Times New Roman"/>
+          <w:kern w:val="0"/>
+        </w:rPr>
+        <w:t xml:space="preserve">        Arrays</w:t>
+      </w:r>
     </w:p>
     <w:p>
       <w:pPr>
@@ -16030,165 +16454,23 @@
           <w:rFonts w:ascii="Times New Roman" w:hAnsi="Times New Roman" w:cs="Times New Roman"/>
           <w:kern w:val="0"/>
         </w:rPr>
-        <w:t xml:space="preserve">        Map</w:t>
-      </w:r>
-      <w:r>
-        <w:rPr>
-          <w:rFonts w:ascii="Times New Roman" w:hAnsi="Times New Roman" w:cs="Times New Roman"/>
-          <w:color w:val="666666"/>
-          <w:kern w:val="0"/>
-        </w:rPr>
-        <w:t>&lt;</w:t>
-      </w:r>
-      <w:r>
-        <w:rPr>
-          <w:rFonts w:ascii="Times New Roman" w:hAnsi="Times New Roman" w:cs="Times New Roman"/>
-          <w:kern w:val="0"/>
-        </w:rPr>
-        <w:t xml:space="preserve">String </w:t>
-      </w:r>
-      <w:r>
-        <w:rPr>
-          <w:rFonts w:ascii="Times New Roman" w:hAnsi="Times New Roman" w:cs="Times New Roman"/>
-          <w:color w:val="666666"/>
-          <w:kern w:val="0"/>
-        </w:rPr>
-        <w:t>,</w:t>
-      </w:r>
-      <w:r>
-        <w:rPr>
-          <w:rFonts w:ascii="Times New Roman" w:hAnsi="Times New Roman" w:cs="Times New Roman"/>
-          <w:kern w:val="0"/>
-        </w:rPr>
-        <w:t xml:space="preserve"> Long</w:t>
-      </w:r>
-      <w:r>
-        <w:rPr>
-          <w:rFonts w:ascii="Times New Roman" w:hAnsi="Times New Roman" w:cs="Times New Roman"/>
-          <w:color w:val="666666"/>
-          <w:kern w:val="0"/>
-        </w:rPr>
-        <w:t>&gt;</w:t>
-      </w:r>
-      <w:r>
-        <w:rPr>
-          <w:rFonts w:ascii="Times New Roman" w:hAnsi="Times New Roman" w:cs="Times New Roman"/>
-          <w:kern w:val="0"/>
-        </w:rPr>
-        <w:t xml:space="preserve"> </w:t>
-      </w:r>
-      <w:proofErr w:type="spellStart"/>
-      <w:r>
-        <w:rPr>
-          <w:rFonts w:ascii="Times New Roman" w:hAnsi="Times New Roman" w:cs="Times New Roman"/>
-          <w:kern w:val="0"/>
-        </w:rPr>
-        <w:t>freqMap</w:t>
-      </w:r>
-      <w:proofErr w:type="spellEnd"/>
-      <w:r>
-        <w:rPr>
-          <w:rFonts w:ascii="Times New Roman" w:hAnsi="Times New Roman" w:cs="Times New Roman"/>
-          <w:kern w:val="0"/>
-        </w:rPr>
-        <w:t xml:space="preserve"> </w:t>
-      </w:r>
-      <w:r>
-        <w:rPr>
-          <w:rFonts w:ascii="Times New Roman" w:hAnsi="Times New Roman" w:cs="Times New Roman"/>
-          <w:color w:val="666666"/>
-          <w:kern w:val="0"/>
-        </w:rPr>
-        <w:t>=</w:t>
-      </w:r>
-      <w:r>
-        <w:rPr>
-          <w:rFonts w:ascii="Times New Roman" w:hAnsi="Times New Roman" w:cs="Times New Roman"/>
-          <w:kern w:val="0"/>
-        </w:rPr>
-        <w:t xml:space="preserve"> </w:t>
-      </w:r>
-      <w:proofErr w:type="spellStart"/>
-      <w:r>
-        <w:rPr>
-          <w:rFonts w:ascii="Times New Roman" w:hAnsi="Times New Roman" w:cs="Times New Roman"/>
-          <w:kern w:val="0"/>
-        </w:rPr>
-        <w:t>Stream</w:t>
-      </w:r>
-      <w:r>
-        <w:rPr>
-          <w:rFonts w:ascii="Times New Roman" w:hAnsi="Times New Roman" w:cs="Times New Roman"/>
-          <w:color w:val="666666"/>
-          <w:kern w:val="0"/>
-        </w:rPr>
-        <w:t>.</w:t>
-      </w:r>
-      <w:r>
-        <w:rPr>
-          <w:rFonts w:ascii="Times New Roman" w:hAnsi="Times New Roman" w:cs="Times New Roman"/>
-          <w:color w:val="7D9029"/>
-          <w:kern w:val="0"/>
-        </w:rPr>
-        <w:t>of</w:t>
-      </w:r>
-      <w:proofErr w:type="spellEnd"/>
-      <w:r>
-        <w:rPr>
-          <w:rFonts w:ascii="Times New Roman" w:hAnsi="Times New Roman" w:cs="Times New Roman"/>
-          <w:color w:val="666666"/>
-          <w:kern w:val="0"/>
-        </w:rPr>
-        <w:t>(</w:t>
-      </w:r>
-      <w:proofErr w:type="spellStart"/>
-      <w:r>
-        <w:rPr>
-          <w:rFonts w:ascii="Times New Roman" w:hAnsi="Times New Roman" w:cs="Times New Roman"/>
-          <w:kern w:val="0"/>
-        </w:rPr>
-        <w:t>input</w:t>
-      </w:r>
-      <w:r>
-        <w:rPr>
-          <w:rFonts w:ascii="Times New Roman" w:hAnsi="Times New Roman" w:cs="Times New Roman"/>
-          <w:color w:val="666666"/>
-          <w:kern w:val="0"/>
-        </w:rPr>
-        <w:t>.</w:t>
-      </w:r>
-      <w:r>
-        <w:rPr>
-          <w:rFonts w:ascii="Times New Roman" w:hAnsi="Times New Roman" w:cs="Times New Roman"/>
-          <w:color w:val="7D9029"/>
-          <w:kern w:val="0"/>
-        </w:rPr>
-        <w:t>split</w:t>
-      </w:r>
-      <w:proofErr w:type="spellEnd"/>
-      <w:r>
-        <w:rPr>
-          <w:rFonts w:ascii="Times New Roman" w:hAnsi="Times New Roman" w:cs="Times New Roman"/>
-          <w:color w:val="666666"/>
-          <w:kern w:val="0"/>
-        </w:rPr>
-        <w:t>(</w:t>
-      </w:r>
-      <w:r>
-        <w:rPr>
-          <w:rFonts w:ascii="Times New Roman" w:hAnsi="Times New Roman" w:cs="Times New Roman"/>
-          <w:color w:val="BA2121"/>
-          <w:kern w:val="0"/>
-        </w:rPr>
-        <w:t>" "</w:t>
-      </w:r>
-      <w:r>
-        <w:rPr>
-          <w:rFonts w:ascii="Times New Roman" w:hAnsi="Times New Roman" w:cs="Times New Roman"/>
-          <w:color w:val="666666"/>
-          <w:kern w:val="0"/>
-        </w:rPr>
-        <w:t>)).</w:t>
+        <w:t xml:space="preserve">        </w:t>
+      </w:r>
+      <w:proofErr w:type="gramStart"/>
+      <w:r>
+        <w:rPr>
+          <w:rFonts w:ascii="Times New Roman" w:hAnsi="Times New Roman" w:cs="Times New Roman"/>
+          <w:kern w:val="0"/>
+        </w:rPr>
+        <w:t>.stream</w:t>
+      </w:r>
+      <w:proofErr w:type="gramEnd"/>
+      <w:r>
+        <w:rPr>
+          <w:rFonts w:ascii="Times New Roman" w:hAnsi="Times New Roman" w:cs="Times New Roman"/>
+          <w:kern w:val="0"/>
+        </w:rPr>
+        <w:t>(words)</w:t>
       </w:r>
     </w:p>
     <w:p>
@@ -16207,158 +16489,23 @@
           <w:rFonts w:ascii="Times New Roman" w:hAnsi="Times New Roman" w:cs="Times New Roman"/>
           <w:kern w:val="0"/>
         </w:rPr>
-        <w:t xml:space="preserve">        collect</w:t>
-      </w:r>
-      <w:r>
-        <w:rPr>
-          <w:rFonts w:ascii="Times New Roman" w:hAnsi="Times New Roman" w:cs="Times New Roman"/>
-          <w:color w:val="666666"/>
+        <w:t xml:space="preserve">        </w:t>
+      </w:r>
+      <w:proofErr w:type="gramStart"/>
+      <w:r>
+        <w:rPr>
+          <w:rFonts w:ascii="Times New Roman" w:hAnsi="Times New Roman" w:cs="Times New Roman"/>
+          <w:kern w:val="0"/>
+        </w:rPr>
+        <w:t>.collect</w:t>
+      </w:r>
+      <w:proofErr w:type="gramEnd"/>
+      <w:r>
+        <w:rPr>
+          <w:rFonts w:ascii="Times New Roman" w:hAnsi="Times New Roman" w:cs="Times New Roman"/>
           <w:kern w:val="0"/>
         </w:rPr>
         <w:t>(</w:t>
-      </w:r>
-      <w:proofErr w:type="spellStart"/>
-      <w:r>
-        <w:rPr>
-          <w:rFonts w:ascii="Times New Roman" w:hAnsi="Times New Roman" w:cs="Times New Roman"/>
-          <w:kern w:val="0"/>
-        </w:rPr>
-        <w:t>Collectors</w:t>
-      </w:r>
-      <w:r>
-        <w:rPr>
-          <w:rFonts w:ascii="Times New Roman" w:hAnsi="Times New Roman" w:cs="Times New Roman"/>
-          <w:color w:val="666666"/>
-          <w:kern w:val="0"/>
-        </w:rPr>
-        <w:t>.</w:t>
-      </w:r>
-      <w:r>
-        <w:rPr>
-          <w:rFonts w:ascii="Times New Roman" w:hAnsi="Times New Roman" w:cs="Times New Roman"/>
-          <w:color w:val="7D9029"/>
-          <w:kern w:val="0"/>
-        </w:rPr>
-        <w:t>groupingBy</w:t>
-      </w:r>
-      <w:proofErr w:type="spellEnd"/>
-      <w:r>
-        <w:rPr>
-          <w:rFonts w:ascii="Times New Roman" w:hAnsi="Times New Roman" w:cs="Times New Roman"/>
-          <w:color w:val="666666"/>
-          <w:kern w:val="0"/>
-        </w:rPr>
-        <w:t>(</w:t>
-      </w:r>
-      <w:proofErr w:type="spellStart"/>
-      <w:r>
-        <w:rPr>
-          <w:rFonts w:ascii="Times New Roman" w:hAnsi="Times New Roman" w:cs="Times New Roman"/>
-          <w:kern w:val="0"/>
-        </w:rPr>
-        <w:t>Function</w:t>
-      </w:r>
-      <w:r>
-        <w:rPr>
-          <w:rFonts w:ascii="Times New Roman" w:hAnsi="Times New Roman" w:cs="Times New Roman"/>
-          <w:color w:val="666666"/>
-          <w:kern w:val="0"/>
-        </w:rPr>
-        <w:t>.</w:t>
-      </w:r>
-      <w:r>
-        <w:rPr>
-          <w:rFonts w:ascii="Times New Roman" w:hAnsi="Times New Roman" w:cs="Times New Roman"/>
-          <w:color w:val="7D9029"/>
-          <w:kern w:val="0"/>
-        </w:rPr>
-        <w:t>identity</w:t>
-      </w:r>
-      <w:proofErr w:type="spellEnd"/>
-      <w:r>
-        <w:rPr>
-          <w:rFonts w:ascii="Times New Roman" w:hAnsi="Times New Roman" w:cs="Times New Roman"/>
-          <w:color w:val="666666"/>
-          <w:kern w:val="0"/>
-        </w:rPr>
-        <w:t>()</w:t>
-      </w:r>
-      <w:r>
-        <w:rPr>
-          <w:rFonts w:ascii="Times New Roman" w:hAnsi="Times New Roman" w:cs="Times New Roman"/>
-          <w:kern w:val="0"/>
-        </w:rPr>
-        <w:t xml:space="preserve"> </w:t>
-      </w:r>
-      <w:r>
-        <w:rPr>
-          <w:rFonts w:ascii="Times New Roman" w:hAnsi="Times New Roman" w:cs="Times New Roman"/>
-          <w:color w:val="666666"/>
-          <w:kern w:val="0"/>
-        </w:rPr>
-        <w:t>,</w:t>
-      </w:r>
-      <w:r>
-        <w:rPr>
-          <w:rFonts w:ascii="Times New Roman" w:hAnsi="Times New Roman" w:cs="Times New Roman"/>
-          <w:kern w:val="0"/>
-        </w:rPr>
-        <w:t xml:space="preserve"> </w:t>
-      </w:r>
-      <w:proofErr w:type="spellStart"/>
-      <w:r>
-        <w:rPr>
-          <w:rFonts w:ascii="Times New Roman" w:hAnsi="Times New Roman" w:cs="Times New Roman"/>
-          <w:kern w:val="0"/>
-        </w:rPr>
-        <w:t>Collectors</w:t>
-      </w:r>
-      <w:r>
-        <w:rPr>
-          <w:rFonts w:ascii="Times New Roman" w:hAnsi="Times New Roman" w:cs="Times New Roman"/>
-          <w:color w:val="666666"/>
-          <w:kern w:val="0"/>
-        </w:rPr>
-        <w:t>.</w:t>
-      </w:r>
-      <w:r>
-        <w:rPr>
-          <w:rFonts w:ascii="Times New Roman" w:hAnsi="Times New Roman" w:cs="Times New Roman"/>
-          <w:color w:val="7D9029"/>
-          <w:kern w:val="0"/>
-        </w:rPr>
-        <w:t>counting</w:t>
-      </w:r>
-      <w:proofErr w:type="spellEnd"/>
-      <w:r>
-        <w:rPr>
-          <w:rFonts w:ascii="Times New Roman" w:hAnsi="Times New Roman" w:cs="Times New Roman"/>
-          <w:color w:val="666666"/>
-          <w:kern w:val="0"/>
-        </w:rPr>
-        <w:t>()))</w:t>
-      </w:r>
-      <w:r>
-        <w:rPr>
-          <w:rFonts w:ascii="Times New Roman" w:hAnsi="Times New Roman" w:cs="Times New Roman"/>
-          <w:kern w:val="0"/>
-        </w:rPr>
-        <w:t xml:space="preserve"> </w:t>
-      </w:r>
-      <w:r>
-        <w:rPr>
-          <w:rFonts w:ascii="Times New Roman" w:hAnsi="Times New Roman" w:cs="Times New Roman"/>
-          <w:color w:val="666666"/>
-          <w:kern w:val="0"/>
-        </w:rPr>
-        <w:t>;</w:t>
-      </w:r>
-      <w:r>
-        <w:rPr>
-          <w:rFonts w:ascii="Times New Roman" w:hAnsi="Times New Roman" w:cs="Times New Roman"/>
-          <w:kern w:val="0"/>
-        </w:rPr>
-        <w:t xml:space="preserve"> </w:t>
       </w:r>
     </w:p>
     <w:p>
@@ -16372,6 +16519,29 @@
           <w:kern w:val="0"/>
         </w:rPr>
       </w:pPr>
+      <w:r>
+        <w:rPr>
+          <w:rFonts w:ascii="Times New Roman" w:hAnsi="Times New Roman" w:cs="Times New Roman"/>
+          <w:kern w:val="0"/>
+        </w:rPr>
+        <w:t xml:space="preserve">            </w:t>
+      </w:r>
+      <w:proofErr w:type="spellStart"/>
+      <w:r>
+        <w:rPr>
+          <w:rFonts w:ascii="Times New Roman" w:hAnsi="Times New Roman" w:cs="Times New Roman"/>
+          <w:kern w:val="0"/>
+        </w:rPr>
+        <w:t>Collectors.groupingBy</w:t>
+      </w:r>
+      <w:proofErr w:type="spellEnd"/>
+      <w:r>
+        <w:rPr>
+          <w:rFonts w:ascii="Times New Roman" w:hAnsi="Times New Roman" w:cs="Times New Roman"/>
+          <w:kern w:val="0"/>
+        </w:rPr>
+        <w:t>(</w:t>
+      </w:r>
     </w:p>
     <w:p>
       <w:pPr>
@@ -16389,146 +16559,39 @@
           <w:rFonts w:ascii="Times New Roman" w:hAnsi="Times New Roman" w:cs="Times New Roman"/>
           <w:kern w:val="0"/>
         </w:rPr>
-        <w:t xml:space="preserve">        </w:t>
-      </w:r>
-      <w:proofErr w:type="spellStart"/>
-      <w:r>
-        <w:rPr>
-          <w:rFonts w:ascii="Times New Roman" w:hAnsi="Times New Roman" w:cs="Times New Roman"/>
-          <w:kern w:val="0"/>
-        </w:rPr>
-        <w:t>freqMap</w:t>
-      </w:r>
-      <w:r>
-        <w:rPr>
-          <w:rFonts w:ascii="Times New Roman" w:hAnsi="Times New Roman" w:cs="Times New Roman"/>
-          <w:color w:val="666666"/>
-          <w:kern w:val="0"/>
-        </w:rPr>
-        <w:t>.</w:t>
-      </w:r>
-      <w:r>
-        <w:rPr>
-          <w:rFonts w:ascii="Times New Roman" w:hAnsi="Times New Roman" w:cs="Times New Roman"/>
-          <w:color w:val="7D9029"/>
-          <w:kern w:val="0"/>
-        </w:rPr>
-        <w:t>entrySet</w:t>
-      </w:r>
-      <w:proofErr w:type="spellEnd"/>
-      <w:r>
-        <w:rPr>
-          <w:rFonts w:ascii="Times New Roman" w:hAnsi="Times New Roman" w:cs="Times New Roman"/>
-          <w:color w:val="666666"/>
-          <w:kern w:val="0"/>
-        </w:rPr>
-        <w:t>().</w:t>
-      </w:r>
-      <w:r>
-        <w:rPr>
-          <w:rFonts w:ascii="Times New Roman" w:hAnsi="Times New Roman" w:cs="Times New Roman"/>
-          <w:color w:val="7D9029"/>
-          <w:kern w:val="0"/>
-        </w:rPr>
-        <w:t>stream</w:t>
-      </w:r>
-      <w:r>
-        <w:rPr>
-          <w:rFonts w:ascii="Times New Roman" w:hAnsi="Times New Roman" w:cs="Times New Roman"/>
-          <w:color w:val="666666"/>
-          <w:kern w:val="0"/>
-        </w:rPr>
-        <w:t>().</w:t>
-      </w:r>
-      <w:proofErr w:type="spellStart"/>
-      <w:r>
-        <w:rPr>
-          <w:rFonts w:ascii="Times New Roman" w:hAnsi="Times New Roman" w:cs="Times New Roman"/>
-          <w:color w:val="7D9029"/>
-          <w:kern w:val="0"/>
-        </w:rPr>
-        <w:t>forEach</w:t>
-      </w:r>
-      <w:proofErr w:type="spellEnd"/>
-      <w:r>
-        <w:rPr>
-          <w:rFonts w:ascii="Times New Roman" w:hAnsi="Times New Roman" w:cs="Times New Roman"/>
-          <w:color w:val="666666"/>
+        <w:t xml:space="preserve">                </w:t>
+      </w:r>
+      <w:proofErr w:type="spellStart"/>
+      <w:r>
+        <w:rPr>
+          <w:rFonts w:ascii="Times New Roman" w:hAnsi="Times New Roman" w:cs="Times New Roman"/>
+          <w:kern w:val="0"/>
+        </w:rPr>
+        <w:t>Function.identity</w:t>
+      </w:r>
+      <w:proofErr w:type="spellEnd"/>
+      <w:r>
+        <w:rPr>
+          <w:rFonts w:ascii="Times New Roman" w:hAnsi="Times New Roman" w:cs="Times New Roman"/>
           <w:kern w:val="0"/>
         </w:rPr>
         <w:t>(</w:t>
       </w:r>
-      <w:proofErr w:type="spellStart"/>
-      <w:r>
-        <w:rPr>
-          <w:rFonts w:ascii="Times New Roman" w:hAnsi="Times New Roman" w:cs="Times New Roman"/>
-          <w:kern w:val="0"/>
-        </w:rPr>
-        <w:t>System</w:t>
-      </w:r>
-      <w:r>
-        <w:rPr>
-          <w:rFonts w:ascii="Times New Roman" w:hAnsi="Times New Roman" w:cs="Times New Roman"/>
-          <w:color w:val="666666"/>
-          <w:kern w:val="0"/>
-        </w:rPr>
-        <w:t>.</w:t>
-      </w:r>
-      <w:r>
-        <w:rPr>
-          <w:rFonts w:ascii="Times New Roman" w:hAnsi="Times New Roman" w:cs="Times New Roman"/>
-          <w:color w:val="7D9029"/>
-          <w:kern w:val="0"/>
-        </w:rPr>
-        <w:t>out</w:t>
-      </w:r>
-      <w:proofErr w:type="spellEnd"/>
-      <w:r>
-        <w:rPr>
-          <w:rFonts w:ascii="Times New Roman" w:hAnsi="Times New Roman" w:cs="Times New Roman"/>
-          <w:color w:val="666666"/>
-          <w:kern w:val="0"/>
-        </w:rPr>
-        <w:t>::</w:t>
-      </w:r>
-      <w:proofErr w:type="spellStart"/>
-      <w:r>
-        <w:rPr>
-          <w:rFonts w:ascii="Times New Roman" w:hAnsi="Times New Roman" w:cs="Times New Roman"/>
-          <w:kern w:val="0"/>
-        </w:rPr>
-        <w:t>println</w:t>
-      </w:r>
-      <w:proofErr w:type="spellEnd"/>
-      <w:r>
-        <w:rPr>
-          <w:rFonts w:ascii="Times New Roman" w:hAnsi="Times New Roman" w:cs="Times New Roman"/>
-          <w:color w:val="666666"/>
-          <w:kern w:val="0"/>
-        </w:rPr>
-        <w:t>)</w:t>
-      </w:r>
-      <w:r>
-        <w:rPr>
-          <w:rFonts w:ascii="Times New Roman" w:hAnsi="Times New Roman" w:cs="Times New Roman"/>
-          <w:kern w:val="0"/>
-        </w:rPr>
-        <w:t xml:space="preserve"> </w:t>
-      </w:r>
-      <w:r>
-        <w:rPr>
-          <w:rFonts w:ascii="Times New Roman" w:hAnsi="Times New Roman" w:cs="Times New Roman"/>
-          <w:color w:val="666666"/>
-          <w:kern w:val="0"/>
-        </w:rPr>
-        <w:t>;</w:t>
-      </w:r>
-      <w:r>
-        <w:rPr>
-          <w:rFonts w:ascii="Times New Roman" w:hAnsi="Times New Roman" w:cs="Times New Roman"/>
-          <w:kern w:val="0"/>
-        </w:rPr>
-        <w:t xml:space="preserve">    </w:t>
+      <w:proofErr w:type="gramStart"/>
+      <w:r>
+        <w:rPr>
+          <w:rFonts w:ascii="Times New Roman" w:hAnsi="Times New Roman" w:cs="Times New Roman"/>
+          <w:kern w:val="0"/>
+        </w:rPr>
+        <w:t>) ,</w:t>
+      </w:r>
+      <w:proofErr w:type="gramEnd"/>
+      <w:r>
+        <w:rPr>
+          <w:rFonts w:ascii="Times New Roman" w:hAnsi="Times New Roman" w:cs="Times New Roman"/>
+          <w:kern w:val="0"/>
+        </w:rPr>
+        <w:t xml:space="preserve"> </w:t>
       </w:r>
     </w:p>
     <w:p>
@@ -16542,143 +16605,1586 @@
           <w:kern w:val="0"/>
         </w:rPr>
       </w:pPr>
-    </w:p>
-    <w:p>
-      <w:proofErr w:type="spellStart"/>
-      <w:r>
+      <w:r>
+        <w:rPr>
+          <w:rFonts w:ascii="Times New Roman" w:hAnsi="Times New Roman" w:cs="Times New Roman"/>
+          <w:kern w:val="0"/>
+        </w:rPr>
+        <w:t xml:space="preserve">                </w:t>
+      </w:r>
+      <w:proofErr w:type="spellStart"/>
+      <w:r>
+        <w:rPr>
+          <w:rFonts w:ascii="Times New Roman" w:hAnsi="Times New Roman" w:cs="Times New Roman"/>
+          <w:kern w:val="0"/>
+        </w:rPr>
+        <w:t>Collectors.counting</w:t>
+      </w:r>
+      <w:proofErr w:type="spellEnd"/>
+      <w:r>
+        <w:rPr>
+          <w:rFonts w:ascii="Times New Roman" w:hAnsi="Times New Roman" w:cs="Times New Roman"/>
+          <w:kern w:val="0"/>
+        </w:rPr>
+        <w:t>()</w:t>
+      </w:r>
+    </w:p>
+    <w:p>
+      <w:pPr>
+        <w:autoSpaceDE w:val="0"/>
+        <w:autoSpaceDN w:val="0"/>
+        <w:adjustRightInd w:val="0"/>
+        <w:spacing w:after="0" w:line="240" w:lineRule="auto"/>
+        <w:rPr>
+          <w:rFonts w:ascii="Times New Roman" w:hAnsi="Times New Roman" w:cs="Times New Roman"/>
+          <w:kern w:val="0"/>
+        </w:rPr>
+      </w:pPr>
+      <w:r>
+        <w:rPr>
+          <w:rFonts w:ascii="Times New Roman" w:hAnsi="Times New Roman" w:cs="Times New Roman"/>
+          <w:kern w:val="0"/>
+        </w:rPr>
+        <w:t xml:space="preserve">            )</w:t>
+      </w:r>
+    </w:p>
+    <w:p>
+      <w:pPr>
+        <w:autoSpaceDE w:val="0"/>
+        <w:autoSpaceDN w:val="0"/>
+        <w:adjustRightInd w:val="0"/>
+        <w:spacing w:after="0" w:line="240" w:lineRule="auto"/>
+        <w:rPr>
+          <w:rFonts w:ascii="Times New Roman" w:hAnsi="Times New Roman" w:cs="Times New Roman"/>
+          <w:kern w:val="0"/>
+        </w:rPr>
+      </w:pPr>
+      <w:r>
+        <w:rPr>
+          <w:rFonts w:ascii="Times New Roman" w:hAnsi="Times New Roman" w:cs="Times New Roman"/>
+          <w:kern w:val="0"/>
+        </w:rPr>
+        <w:t xml:space="preserve">        );</w:t>
+      </w:r>
+    </w:p>
+    <w:p>
+      <w:pPr>
+        <w:autoSpaceDE w:val="0"/>
+        <w:autoSpaceDN w:val="0"/>
+        <w:adjustRightInd w:val="0"/>
+        <w:spacing w:after="0" w:line="240" w:lineRule="auto"/>
+        <w:rPr>
+          <w:rFonts w:ascii="Times New Roman" w:hAnsi="Times New Roman" w:cs="Times New Roman"/>
+          <w:kern w:val="0"/>
+        </w:rPr>
+      </w:pPr>
+    </w:p>
+    <w:p>
+      <w:pPr>
+        <w:autoSpaceDE w:val="0"/>
+        <w:autoSpaceDN w:val="0"/>
+        <w:adjustRightInd w:val="0"/>
+        <w:spacing w:after="0" w:line="240" w:lineRule="auto"/>
+        <w:rPr>
+          <w:rFonts w:ascii="Times New Roman" w:hAnsi="Times New Roman" w:cs="Times New Roman"/>
+          <w:kern w:val="0"/>
+        </w:rPr>
+      </w:pPr>
+      <w:r>
+        <w:rPr>
+          <w:rFonts w:ascii="Times New Roman" w:hAnsi="Times New Roman" w:cs="Times New Roman"/>
+          <w:kern w:val="0"/>
+        </w:rPr>
+        <w:t xml:space="preserve">        </w:t>
+      </w:r>
+      <w:proofErr w:type="spellStart"/>
+      <w:proofErr w:type="gramStart"/>
+      <w:r>
+        <w:rPr>
+          <w:rFonts w:ascii="Times New Roman" w:hAnsi="Times New Roman" w:cs="Times New Roman"/>
+          <w:kern w:val="0"/>
+        </w:rPr>
+        <w:t>out.println</w:t>
+      </w:r>
+      <w:proofErr w:type="spellEnd"/>
+      <w:proofErr w:type="gramEnd"/>
+      <w:r>
+        <w:rPr>
+          <w:rFonts w:ascii="Times New Roman" w:hAnsi="Times New Roman" w:cs="Times New Roman"/>
+          <w:kern w:val="0"/>
+        </w:rPr>
+        <w:t>(</w:t>
+      </w:r>
+      <w:proofErr w:type="spellStart"/>
+      <w:r>
+        <w:rPr>
+          <w:rFonts w:ascii="Times New Roman" w:hAnsi="Times New Roman" w:cs="Times New Roman"/>
+          <w:kern w:val="0"/>
+        </w:rPr>
+        <w:t>fmap</w:t>
+      </w:r>
+      <w:proofErr w:type="spellEnd"/>
+      <w:r>
+        <w:rPr>
+          <w:rFonts w:ascii="Times New Roman" w:hAnsi="Times New Roman" w:cs="Times New Roman"/>
+          <w:kern w:val="0"/>
+        </w:rPr>
+        <w:t xml:space="preserve">); </w:t>
+      </w:r>
+      <w:r>
+        <w:rPr>
+          <w:rFonts w:ascii="Times New Roman" w:hAnsi="Times New Roman" w:cs="Times New Roman"/>
+          <w:kern w:val="0"/>
+        </w:rPr>
+        <w:t xml:space="preserve"> </w:t>
+      </w:r>
+    </w:p>
+    <w:p>
+      <w:pPr>
+        <w:autoSpaceDE w:val="0"/>
+        <w:autoSpaceDN w:val="0"/>
+        <w:adjustRightInd w:val="0"/>
+        <w:spacing w:after="0" w:line="240" w:lineRule="auto"/>
+        <w:rPr>
+          <w:rFonts w:ascii="Times New Roman" w:hAnsi="Times New Roman" w:cs="Times New Roman"/>
+          <w:kern w:val="0"/>
+        </w:rPr>
+      </w:pPr>
+    </w:p>
+    <w:p>
+      <w:proofErr w:type="spellStart"/>
+      <w:r>
+        <w:t>Function.identity</w:t>
+      </w:r>
+      <w:proofErr w:type="spellEnd"/>
+      <w:r>
+        <w:t>()</w:t>
+      </w:r>
+      <w:r>
+        <w:t xml:space="preserve"> </w:t>
+      </w:r>
+      <w:r>
+        <w:t xml:space="preserve">will </w:t>
+      </w:r>
+      <w:r>
+        <w:t xml:space="preserve">just </w:t>
+      </w:r>
+      <w:r>
+        <w:t>return</w:t>
+      </w:r>
+      <w:r>
+        <w:t xml:space="preserve"> the same </w:t>
+      </w:r>
+      <w:r>
+        <w:t xml:space="preserve">as it takes an </w:t>
+      </w:r>
+      <w:proofErr w:type="spellStart"/>
+      <w:r>
+        <w:t>i</w:t>
+      </w:r>
+      <w:proofErr w:type="spellEnd"/>
+      <w:r>
+        <w:t>/p</w:t>
+      </w:r>
+    </w:p>
+    <w:p>
+      <w:pPr>
+        <w:rPr>
+          <w:lang w:val="en-US"/>
+        </w:rPr>
+      </w:pPr>
+      <w:r>
+        <w:rPr>
+          <w:lang w:val="en-US"/>
+        </w:rPr>
+        <w:t>O/</w:t>
+      </w:r>
+      <w:proofErr w:type="gramStart"/>
+      <w:r>
+        <w:rPr>
+          <w:lang w:val="en-US"/>
+        </w:rPr>
+        <w:t>p :</w:t>
+      </w:r>
+      <w:proofErr w:type="gramEnd"/>
+      <w:r>
+        <w:rPr>
+          <w:lang w:val="en-US"/>
+        </w:rPr>
+        <w:t xml:space="preserve"> </w:t>
+      </w:r>
+    </w:p>
+    <w:p>
+      <w:pPr>
+        <w:rPr>
+          <w:lang w:val="en-US"/>
+        </w:rPr>
+      </w:pPr>
+      <w:r>
+        <w:rPr>
+          <w:lang w:val="en-US"/>
+        </w:rPr>
+        <w:t>take=1</w:t>
+      </w:r>
+    </w:p>
+    <w:p>
+      <w:pPr>
+        <w:rPr>
+          <w:lang w:val="en-US"/>
+        </w:rPr>
+      </w:pPr>
+      <w:r>
+        <w:rPr>
+          <w:lang w:val="en-US"/>
+        </w:rPr>
+        <w:t>this=3</w:t>
+      </w:r>
+    </w:p>
+    <w:p>
+      <w:pPr>
+        <w:rPr>
+          <w:lang w:val="en-US"/>
+        </w:rPr>
+      </w:pPr>
+      <w:r>
+        <w:rPr>
+          <w:lang w:val="en-US"/>
+        </w:rPr>
+        <w:t>moment=2</w:t>
+      </w:r>
+    </w:p>
+    <w:p>
+      <w:pPr>
+        <w:pStyle w:val="Heading2"/>
+        <w:rPr>
+          <w:lang w:val="en-US"/>
+        </w:rPr>
+      </w:pPr>
+      <w:r>
+        <w:rPr>
+          <w:lang w:val="en-US"/>
+        </w:rPr>
+        <w:t>Partition numbers into even and odd</w:t>
+      </w:r>
+    </w:p>
+    <w:p>
+      <w:pPr>
+        <w:rPr>
+          <w:lang w:val="en-US"/>
+        </w:rPr>
+      </w:pPr>
+    </w:p>
+    <w:p>
+      <w:pPr>
+        <w:rPr>
+          <w:lang w:val="en-US"/>
+        </w:rPr>
+      </w:pPr>
+      <w:r>
+        <w:rPr>
+          <w:lang w:val="en-US"/>
+        </w:rPr>
+        <w:t xml:space="preserve">        int </w:t>
+      </w:r>
+      <w:proofErr w:type="spellStart"/>
+      <w:proofErr w:type="gramStart"/>
+      <w:r>
+        <w:rPr>
+          <w:lang w:val="en-US"/>
+        </w:rPr>
+        <w:t>nums</w:t>
+      </w:r>
+      <w:proofErr w:type="spellEnd"/>
+      <w:r>
+        <w:rPr>
+          <w:lang w:val="en-US"/>
+        </w:rPr>
+        <w:t>[</w:t>
+      </w:r>
+      <w:proofErr w:type="gramEnd"/>
+      <w:r>
+        <w:rPr>
+          <w:lang w:val="en-US"/>
+        </w:rPr>
+        <w:t>] = {</w:t>
+      </w:r>
+      <w:proofErr w:type="gramStart"/>
+      <w:r>
+        <w:rPr>
+          <w:lang w:val="en-US"/>
+        </w:rPr>
+        <w:t>1 ,</w:t>
+      </w:r>
+      <w:proofErr w:type="gramEnd"/>
+      <w:r>
+        <w:rPr>
+          <w:lang w:val="en-US"/>
+        </w:rPr>
+        <w:t xml:space="preserve"> </w:t>
+      </w:r>
+      <w:proofErr w:type="gramStart"/>
+      <w:r>
+        <w:rPr>
+          <w:lang w:val="en-US"/>
+        </w:rPr>
+        <w:t>2 ,</w:t>
+      </w:r>
+      <w:proofErr w:type="gramEnd"/>
+      <w:r>
+        <w:rPr>
+          <w:lang w:val="en-US"/>
+        </w:rPr>
+        <w:t xml:space="preserve"> </w:t>
+      </w:r>
+      <w:proofErr w:type="gramStart"/>
+      <w:r>
+        <w:rPr>
+          <w:lang w:val="en-US"/>
+        </w:rPr>
+        <w:t>3 ,</w:t>
+      </w:r>
+      <w:proofErr w:type="gramEnd"/>
+      <w:r>
+        <w:rPr>
+          <w:lang w:val="en-US"/>
+        </w:rPr>
+        <w:t xml:space="preserve"> </w:t>
+      </w:r>
+      <w:proofErr w:type="gramStart"/>
+      <w:r>
+        <w:rPr>
+          <w:lang w:val="en-US"/>
+        </w:rPr>
+        <w:t>4 ,</w:t>
+      </w:r>
+      <w:proofErr w:type="gramEnd"/>
+      <w:r>
+        <w:rPr>
+          <w:lang w:val="en-US"/>
+        </w:rPr>
+        <w:t xml:space="preserve"> </w:t>
+      </w:r>
+      <w:proofErr w:type="gramStart"/>
+      <w:r>
+        <w:rPr>
+          <w:lang w:val="en-US"/>
+        </w:rPr>
+        <w:t>5 ,</w:t>
+      </w:r>
+      <w:proofErr w:type="gramEnd"/>
+      <w:r>
+        <w:rPr>
+          <w:lang w:val="en-US"/>
+        </w:rPr>
+        <w:t xml:space="preserve"> </w:t>
+      </w:r>
+      <w:proofErr w:type="gramStart"/>
+      <w:r>
+        <w:rPr>
+          <w:lang w:val="en-US"/>
+        </w:rPr>
+        <w:t>6 }</w:t>
+      </w:r>
+      <w:proofErr w:type="gramEnd"/>
+      <w:r>
+        <w:rPr>
+          <w:lang w:val="en-US"/>
+        </w:rPr>
+        <w:t xml:space="preserve"> ;</w:t>
+      </w:r>
+    </w:p>
+    <w:p>
+      <w:pPr>
+        <w:rPr>
+          <w:lang w:val="en-US"/>
+        </w:rPr>
+      </w:pPr>
+    </w:p>
+    <w:p>
+      <w:pPr>
+        <w:rPr>
+          <w:lang w:val="en-US"/>
+        </w:rPr>
+      </w:pPr>
+      <w:r>
+        <w:rPr>
+          <w:lang w:val="en-US"/>
+        </w:rPr>
+        <w:t xml:space="preserve">        Map&lt;</w:t>
+      </w:r>
+      <w:proofErr w:type="gramStart"/>
+      <w:r>
+        <w:rPr>
+          <w:lang w:val="en-US"/>
+        </w:rPr>
+        <w:t>String ,</w:t>
+      </w:r>
+      <w:proofErr w:type="gramEnd"/>
+      <w:r>
+        <w:rPr>
+          <w:lang w:val="en-US"/>
+        </w:rPr>
+        <w:t xml:space="preserve"> List&lt;Integer&gt; &gt; map =</w:t>
+      </w:r>
+    </w:p>
+    <w:p>
+      <w:pPr>
+        <w:rPr>
+          <w:lang w:val="en-US"/>
+        </w:rPr>
+      </w:pPr>
+      <w:r>
+        <w:rPr>
+          <w:lang w:val="en-US"/>
+        </w:rPr>
+        <w:t xml:space="preserve">        Arrays</w:t>
+      </w:r>
+    </w:p>
+    <w:p>
+      <w:pPr>
+        <w:rPr>
+          <w:lang w:val="en-US"/>
+        </w:rPr>
+      </w:pPr>
+      <w:r>
+        <w:rPr>
+          <w:lang w:val="en-US"/>
+        </w:rPr>
+        <w:t xml:space="preserve">        </w:t>
+      </w:r>
+      <w:proofErr w:type="gramStart"/>
+      <w:r>
+        <w:rPr>
+          <w:lang w:val="en-US"/>
+        </w:rPr>
+        <w:t>.stream</w:t>
+      </w:r>
+      <w:proofErr w:type="gramEnd"/>
+      <w:r>
+        <w:rPr>
+          <w:lang w:val="en-US"/>
+        </w:rPr>
+        <w:t>(</w:t>
+      </w:r>
+      <w:proofErr w:type="spellStart"/>
+      <w:r>
+        <w:rPr>
+          <w:lang w:val="en-US"/>
+        </w:rPr>
+        <w:t>nums</w:t>
+      </w:r>
+      <w:proofErr w:type="spellEnd"/>
+      <w:r>
+        <w:rPr>
+          <w:lang w:val="en-US"/>
+        </w:rPr>
+        <w:t>)</w:t>
+      </w:r>
+    </w:p>
+    <w:p>
+      <w:pPr>
+        <w:rPr>
+          <w:lang w:val="en-US"/>
+        </w:rPr>
+      </w:pPr>
+      <w:r>
+        <w:rPr>
+          <w:lang w:val="en-US"/>
+        </w:rPr>
+        <w:t xml:space="preserve">        </w:t>
+      </w:r>
+      <w:proofErr w:type="gramStart"/>
+      <w:r>
+        <w:rPr>
+          <w:lang w:val="en-US"/>
+        </w:rPr>
+        <w:t>.boxed</w:t>
+      </w:r>
+      <w:proofErr w:type="gramEnd"/>
+      <w:r>
+        <w:rPr>
+          <w:lang w:val="en-US"/>
+        </w:rPr>
+        <w:t>()</w:t>
+      </w:r>
+    </w:p>
+    <w:p>
+      <w:pPr>
+        <w:rPr>
+          <w:lang w:val="en-US"/>
+        </w:rPr>
+      </w:pPr>
+      <w:r>
+        <w:rPr>
+          <w:lang w:val="en-US"/>
+        </w:rPr>
+        <w:t xml:space="preserve">        </w:t>
+      </w:r>
+      <w:proofErr w:type="gramStart"/>
+      <w:r>
+        <w:rPr>
+          <w:lang w:val="en-US"/>
+        </w:rPr>
+        <w:t>.collect</w:t>
+      </w:r>
+      <w:proofErr w:type="gramEnd"/>
+      <w:r>
+        <w:rPr>
+          <w:lang w:val="en-US"/>
+        </w:rPr>
+        <w:t>(</w:t>
+      </w:r>
+    </w:p>
+    <w:p>
+      <w:pPr>
+        <w:rPr>
+          <w:lang w:val="en-US"/>
+        </w:rPr>
+      </w:pPr>
+      <w:r>
+        <w:rPr>
+          <w:lang w:val="en-US"/>
+        </w:rPr>
+        <w:t xml:space="preserve">            </w:t>
+      </w:r>
+      <w:proofErr w:type="spellStart"/>
+      <w:r>
+        <w:rPr>
+          <w:lang w:val="en-US"/>
+        </w:rPr>
+        <w:t>Collectors.groupingBy</w:t>
+      </w:r>
+      <w:proofErr w:type="spellEnd"/>
+      <w:r>
+        <w:rPr>
+          <w:lang w:val="en-US"/>
+        </w:rPr>
+        <w:t>(</w:t>
+      </w:r>
+    </w:p>
+    <w:p>
+      <w:pPr>
+        <w:rPr>
+          <w:lang w:val="en-US"/>
+        </w:rPr>
+      </w:pPr>
+      <w:r>
+        <w:rPr>
+          <w:lang w:val="en-US"/>
+        </w:rPr>
+        <w:t xml:space="preserve">                num -&gt; num%2 == </w:t>
+      </w:r>
+      <w:proofErr w:type="gramStart"/>
+      <w:r>
+        <w:rPr>
+          <w:lang w:val="en-US"/>
+        </w:rPr>
+        <w:t>1 ?</w:t>
+      </w:r>
+      <w:proofErr w:type="gramEnd"/>
+      <w:r>
+        <w:rPr>
+          <w:lang w:val="en-US"/>
+        </w:rPr>
+        <w:t xml:space="preserve"> "Odd</w:t>
+      </w:r>
+      <w:proofErr w:type="gramStart"/>
+      <w:r>
+        <w:rPr>
+          <w:lang w:val="en-US"/>
+        </w:rPr>
+        <w:t>" :</w:t>
+      </w:r>
+      <w:proofErr w:type="gramEnd"/>
+      <w:r>
+        <w:rPr>
+          <w:lang w:val="en-US"/>
+        </w:rPr>
+        <w:t xml:space="preserve"> "Even"</w:t>
+      </w:r>
+    </w:p>
+    <w:p>
+      <w:pPr>
+        <w:rPr>
+          <w:lang w:val="en-US"/>
+        </w:rPr>
+      </w:pPr>
+      <w:r>
+        <w:rPr>
+          <w:lang w:val="en-US"/>
+        </w:rPr>
+        <w:t xml:space="preserve">            )</w:t>
+      </w:r>
+    </w:p>
+    <w:p>
+      <w:pPr>
+        <w:rPr>
+          <w:lang w:val="en-US"/>
+        </w:rPr>
+      </w:pPr>
+      <w:r>
+        <w:rPr>
+          <w:lang w:val="en-US"/>
+        </w:rPr>
+        <w:t xml:space="preserve">        );</w:t>
+      </w:r>
+    </w:p>
+    <w:p>
+      <w:pPr>
+        <w:rPr>
+          <w:lang w:val="en-US"/>
+        </w:rPr>
+      </w:pPr>
+    </w:p>
+    <w:p>
+      <w:pPr>
+        <w:rPr>
+          <w:lang w:val="en-US"/>
+        </w:rPr>
+      </w:pPr>
+      <w:r>
+        <w:rPr>
+          <w:lang w:val="en-US"/>
+        </w:rPr>
+        <w:t xml:space="preserve">        </w:t>
+      </w:r>
+      <w:proofErr w:type="spellStart"/>
+      <w:proofErr w:type="gramStart"/>
+      <w:r>
+        <w:rPr>
+          <w:lang w:val="en-US"/>
+        </w:rPr>
+        <w:t>out.println</w:t>
+      </w:r>
+      <w:proofErr w:type="spellEnd"/>
+      <w:proofErr w:type="gramEnd"/>
+      <w:r>
+        <w:rPr>
+          <w:lang w:val="en-US"/>
+        </w:rPr>
+        <w:t>(map);</w:t>
+      </w:r>
+    </w:p>
+    <w:p>
+      <w:pPr>
+        <w:rPr>
+          <w:lang w:val="en-US"/>
+        </w:rPr>
+      </w:pPr>
+    </w:p>
+    <w:p>
+      <w:pPr>
+        <w:rPr>
+          <w:lang w:val="en-US"/>
+        </w:rPr>
+      </w:pPr>
+    </w:p>
+    <w:p>
+      <w:r>
+        <w:t xml:space="preserve">// Partition numbers into even (true) and odd (false) </w:t>
+      </w:r>
+    </w:p>
+    <w:p>
+      <w:proofErr w:type="spellStart"/>
+      <w:r>
+        <w:t>partitioningBy</w:t>
+      </w:r>
+      <w:proofErr w:type="spellEnd"/>
+      <w:r>
+        <w:t xml:space="preserve"> is highly efficient because the underlying map is specifically optimized for exactly two keys (true and false).</w:t>
+      </w:r>
+    </w:p>
+    <w:p>
+      <w:pPr>
+        <w:rPr>
+          <w:lang w:val="en-US"/>
+        </w:rPr>
+      </w:pPr>
+      <w:r>
+        <w:t xml:space="preserve">Map&lt;Boolean, List&lt;Integer&gt;&gt; </w:t>
+      </w:r>
+      <w:proofErr w:type="spellStart"/>
+      <w:r>
+        <w:t>partitionedNumbers</w:t>
+      </w:r>
+      <w:proofErr w:type="spellEnd"/>
+      <w:r>
+        <w:t xml:space="preserve"> = </w:t>
+      </w:r>
+      <w:proofErr w:type="spellStart"/>
+      <w:proofErr w:type="gramStart"/>
+      <w:r>
+        <w:t>numbers.stream</w:t>
+      </w:r>
+      <w:proofErr w:type="spellEnd"/>
+      <w:proofErr w:type="gramEnd"/>
+      <w:r>
+        <w:t>(</w:t>
+      </w:r>
+      <w:proofErr w:type="gramStart"/>
+      <w:r>
+        <w:t>) .collect</w:t>
+      </w:r>
+      <w:proofErr w:type="gramEnd"/>
+      <w:r>
+        <w:t>(</w:t>
+      </w:r>
+      <w:proofErr w:type="spellStart"/>
+      <w:r>
+        <w:t>Collectors.partitioningBy</w:t>
+      </w:r>
+      <w:proofErr w:type="spellEnd"/>
+      <w:r>
+        <w:t>(n -&gt; n % 2 == 0));</w:t>
+      </w:r>
+      <w:r>
+        <w:rPr>
+          <w:lang w:val="en-US"/>
+        </w:rPr>
+        <w:t xml:space="preserve"> </w:t>
+      </w:r>
+    </w:p>
+    <w:p>
+      <w:pPr>
+        <w:rPr>
+          <w:lang w:val="en-US"/>
+        </w:rPr>
+      </w:pPr>
+    </w:p>
+    <w:p>
+      <w:pPr>
+        <w:pStyle w:val="Heading2"/>
+        <w:rPr>
+          <w:lang w:val="en-US"/>
+        </w:rPr>
+      </w:pPr>
+      <w:r>
+        <w:rPr>
+          <w:lang w:val="en-US"/>
+        </w:rPr>
         <w:lastRenderedPageBreak/>
-        <w:t>Function.identity</w:t>
-      </w:r>
-      <w:proofErr w:type="spellEnd"/>
-      <w:r>
+        <w:t>Given a list of strings, find the length of the longest string that doesn't contain any digits.</w:t>
+      </w:r>
+    </w:p>
+    <w:p>
+      <w:pPr>
+        <w:rPr>
+          <w:lang w:val="en-US"/>
+        </w:rPr>
+      </w:pPr>
+    </w:p>
+    <w:p>
+      <w:pPr>
+        <w:rPr>
+          <w:lang w:val="en-US"/>
+        </w:rPr>
+      </w:pPr>
+      <w:r>
+        <w:rPr>
+          <w:lang w:val="en-US"/>
+        </w:rPr>
+        <w:t xml:space="preserve">        List&lt;String&gt; words = </w:t>
+      </w:r>
+    </w:p>
+    <w:p>
+      <w:pPr>
+        <w:rPr>
+          <w:lang w:val="en-US"/>
+        </w:rPr>
+      </w:pPr>
+      <w:r>
+        <w:rPr>
+          <w:lang w:val="en-US"/>
+        </w:rPr>
+        <w:t xml:space="preserve">        </w:t>
+      </w:r>
+      <w:proofErr w:type="spellStart"/>
+      <w:r>
+        <w:rPr>
+          <w:lang w:val="en-US"/>
+        </w:rPr>
+        <w:t>Arrays.asList</w:t>
+      </w:r>
+      <w:proofErr w:type="spellEnd"/>
+      <w:r>
+        <w:rPr>
+          <w:lang w:val="en-US"/>
+        </w:rPr>
+        <w:t>("Apple", "Java17", "Banana", "Stream API");</w:t>
+      </w:r>
+    </w:p>
+    <w:p>
+      <w:pPr>
+        <w:rPr>
+          <w:lang w:val="en-US"/>
+        </w:rPr>
+      </w:pPr>
+    </w:p>
+    <w:p>
+      <w:pPr>
+        <w:rPr>
+          <w:lang w:val="en-US"/>
+        </w:rPr>
+      </w:pPr>
+      <w:r>
+        <w:rPr>
+          <w:lang w:val="en-US"/>
+        </w:rPr>
+        <w:t xml:space="preserve">        String </w:t>
+      </w:r>
+      <w:proofErr w:type="spellStart"/>
+      <w:r>
+        <w:rPr>
+          <w:lang w:val="en-US"/>
+        </w:rPr>
+        <w:t>ans</w:t>
+      </w:r>
+      <w:proofErr w:type="spellEnd"/>
+      <w:r>
+        <w:rPr>
+          <w:lang w:val="en-US"/>
+        </w:rPr>
+        <w:t xml:space="preserve"> =</w:t>
+      </w:r>
+    </w:p>
+    <w:p>
+      <w:pPr>
+        <w:rPr>
+          <w:lang w:val="en-US"/>
+        </w:rPr>
+      </w:pPr>
+      <w:r>
+        <w:rPr>
+          <w:lang w:val="en-US"/>
+        </w:rPr>
+        <w:t xml:space="preserve">        words</w:t>
+      </w:r>
+    </w:p>
+    <w:p>
+      <w:pPr>
+        <w:rPr>
+          <w:lang w:val="en-US"/>
+        </w:rPr>
+      </w:pPr>
+      <w:r>
+        <w:rPr>
+          <w:lang w:val="en-US"/>
+        </w:rPr>
+        <w:t xml:space="preserve">        </w:t>
+      </w:r>
+      <w:proofErr w:type="gramStart"/>
+      <w:r>
+        <w:rPr>
+          <w:lang w:val="en-US"/>
+        </w:rPr>
+        <w:t>.stream</w:t>
+      </w:r>
+      <w:proofErr w:type="gramEnd"/>
+      <w:r>
+        <w:rPr>
+          <w:lang w:val="en-US"/>
+        </w:rPr>
         <w:t>()</w:t>
       </w:r>
-      <w:r>
-        <w:t xml:space="preserve"> </w:t>
-      </w:r>
-      <w:r>
-        <w:t xml:space="preserve">will </w:t>
-      </w:r>
-      <w:r>
-        <w:t xml:space="preserve">just </w:t>
-      </w:r>
-      <w:r>
-        <w:t>return</w:t>
-      </w:r>
-      <w:r>
-        <w:t xml:space="preserve"> the same </w:t>
-      </w:r>
-      <w:r>
-        <w:t xml:space="preserve">as it takes an </w:t>
-      </w:r>
-      <w:proofErr w:type="spellStart"/>
-      <w:r>
-        <w:t>i</w:t>
-      </w:r>
-      <w:proofErr w:type="spellEnd"/>
-      <w:r>
-        <w:t>/p</w:t>
-      </w:r>
-    </w:p>
-    <w:p>
-      <w:pPr>
-        <w:rPr>
-          <w:lang w:val="en-US"/>
-        </w:rPr>
-      </w:pPr>
-    </w:p>
-    <w:p>
-      <w:pPr>
-        <w:rPr>
-          <w:lang w:val="en-US"/>
-        </w:rPr>
-      </w:pPr>
-      <w:r>
-        <w:rPr>
-          <w:lang w:val="en-US"/>
-        </w:rPr>
-        <w:t>O/</w:t>
+    </w:p>
+    <w:p>
+      <w:pPr>
+        <w:rPr>
+          <w:lang w:val="en-US"/>
+        </w:rPr>
+      </w:pPr>
+      <w:r>
+        <w:rPr>
+          <w:lang w:val="en-US"/>
+        </w:rPr>
+        <w:t xml:space="preserve">        </w:t>
       </w:r>
       <w:proofErr w:type="gramStart"/>
       <w:r>
         <w:rPr>
           <w:lang w:val="en-US"/>
         </w:rPr>
-        <w:t>p :</w:t>
+        <w:t>.filter( word</w:t>
       </w:r>
       <w:proofErr w:type="gramEnd"/>
       <w:r>
         <w:rPr>
           <w:lang w:val="en-US"/>
         </w:rPr>
-        <w:t xml:space="preserve"> </w:t>
-      </w:r>
-    </w:p>
-    <w:p>
-      <w:pPr>
-        <w:rPr>
-          <w:lang w:val="en-US"/>
-        </w:rPr>
-      </w:pPr>
-      <w:r>
-        <w:rPr>
-          <w:lang w:val="en-US"/>
-        </w:rPr>
-        <w:t>take=1</w:t>
-      </w:r>
-    </w:p>
-    <w:p>
-      <w:pPr>
-        <w:rPr>
-          <w:lang w:val="en-US"/>
-        </w:rPr>
-      </w:pPr>
-      <w:r>
-        <w:rPr>
-          <w:lang w:val="en-US"/>
-        </w:rPr>
-        <w:t>this=3</w:t>
-      </w:r>
-    </w:p>
-    <w:p>
-      <w:pPr>
-        <w:rPr>
-          <w:lang w:val="en-US"/>
-        </w:rPr>
-      </w:pPr>
-      <w:r>
-        <w:rPr>
-          <w:lang w:val="en-US"/>
-        </w:rPr>
-        <w:t>moment=2</w:t>
-      </w:r>
-    </w:p>
-    <w:p>
-      <w:pPr>
-        <w:rPr>
-          <w:lang w:val="en-US"/>
-        </w:rPr>
-      </w:pPr>
-    </w:p>
-    <w:p>
-      <w:pPr>
-        <w:rPr>
-          <w:lang w:val="en-US"/>
-        </w:rPr>
-      </w:pPr>
-    </w:p>
-    <w:p>
-      <w:pPr>
-        <w:rPr>
-          <w:lang w:val="en-US"/>
-        </w:rPr>
-      </w:pPr>
-      <w:r>
-        <w:rPr>
-          <w:lang w:val="en-US"/>
-        </w:rPr>
-        <w:t xml:space="preserve"> </w:t>
-      </w:r>
+        <w:t xml:space="preserve"> -&gt; </w:t>
+      </w:r>
+      <w:proofErr w:type="spellStart"/>
+      <w:proofErr w:type="gramStart"/>
+      <w:r>
+        <w:rPr>
+          <w:lang w:val="en-US"/>
+        </w:rPr>
+        <w:t>word.chars</w:t>
+      </w:r>
+      <w:proofErr w:type="spellEnd"/>
+      <w:proofErr w:type="gramEnd"/>
+      <w:r>
+        <w:rPr>
+          <w:lang w:val="en-US"/>
+        </w:rPr>
+        <w:t>().</w:t>
+      </w:r>
+    </w:p>
+    <w:p>
+      <w:pPr>
+        <w:rPr>
+          <w:lang w:val="en-US"/>
+        </w:rPr>
+      </w:pPr>
+      <w:r>
+        <w:rPr>
+          <w:lang w:val="en-US"/>
+        </w:rPr>
+        <w:t xml:space="preserve">            </w:t>
+      </w:r>
+      <w:proofErr w:type="spellStart"/>
+      <w:proofErr w:type="gramStart"/>
+      <w:r>
+        <w:rPr>
+          <w:lang w:val="en-US"/>
+        </w:rPr>
+        <w:t>noneMatch</w:t>
+      </w:r>
+      <w:proofErr w:type="spellEnd"/>
+      <w:r>
+        <w:rPr>
+          <w:lang w:val="en-US"/>
+        </w:rPr>
+        <w:t>( ch</w:t>
+      </w:r>
+      <w:proofErr w:type="gramEnd"/>
+      <w:r>
+        <w:rPr>
+          <w:lang w:val="en-US"/>
+        </w:rPr>
+        <w:t xml:space="preserve"> -&gt; </w:t>
+      </w:r>
+      <w:proofErr w:type="spellStart"/>
+      <w:r>
+        <w:rPr>
+          <w:lang w:val="en-US"/>
+        </w:rPr>
+        <w:t>Character.isDigit</w:t>
+      </w:r>
+      <w:proofErr w:type="spellEnd"/>
+      <w:r>
+        <w:rPr>
+          <w:lang w:val="en-US"/>
+        </w:rPr>
+        <w:t>(ch</w:t>
+      </w:r>
+      <w:proofErr w:type="gramStart"/>
+      <w:r>
+        <w:rPr>
+          <w:lang w:val="en-US"/>
+        </w:rPr>
+        <w:t>) )</w:t>
+      </w:r>
+      <w:proofErr w:type="gramEnd"/>
+      <w:r>
+        <w:rPr>
+          <w:lang w:val="en-US"/>
+        </w:rPr>
+        <w:t xml:space="preserve"> )</w:t>
+      </w:r>
+    </w:p>
+    <w:p>
+      <w:pPr>
+        <w:rPr>
+          <w:lang w:val="en-US"/>
+        </w:rPr>
+      </w:pPr>
+      <w:r>
+        <w:rPr>
+          <w:lang w:val="en-US"/>
+        </w:rPr>
+        <w:t xml:space="preserve">        .</w:t>
+      </w:r>
+      <w:proofErr w:type="gramStart"/>
+      <w:r>
+        <w:rPr>
+          <w:lang w:val="en-US"/>
+        </w:rPr>
+        <w:t>max( (</w:t>
+      </w:r>
+      <w:proofErr w:type="gramEnd"/>
+      <w:r>
+        <w:rPr>
+          <w:lang w:val="en-US"/>
+        </w:rPr>
+        <w:t>word</w:t>
+      </w:r>
+      <w:proofErr w:type="gramStart"/>
+      <w:r>
+        <w:rPr>
+          <w:lang w:val="en-US"/>
+        </w:rPr>
+        <w:t>1,word</w:t>
+      </w:r>
+      <w:proofErr w:type="gramEnd"/>
+      <w:r>
+        <w:rPr>
+          <w:lang w:val="en-US"/>
+        </w:rPr>
+        <w:t xml:space="preserve">2) </w:t>
+      </w:r>
+    </w:p>
+    <w:p>
+      <w:pPr>
+        <w:rPr>
+          <w:lang w:val="en-US"/>
+        </w:rPr>
+      </w:pPr>
+      <w:r>
+        <w:rPr>
+          <w:lang w:val="en-US"/>
+        </w:rPr>
+        <w:t xml:space="preserve">            -&gt; </w:t>
+      </w:r>
+      <w:proofErr w:type="spellStart"/>
+      <w:r>
+        <w:rPr>
+          <w:lang w:val="en-US"/>
+        </w:rPr>
+        <w:t>Integer.compare</w:t>
+      </w:r>
+      <w:proofErr w:type="spellEnd"/>
+      <w:r>
+        <w:rPr>
+          <w:lang w:val="en-US"/>
+        </w:rPr>
+        <w:t>(word1.length(</w:t>
+      </w:r>
+      <w:proofErr w:type="gramStart"/>
+      <w:r>
+        <w:rPr>
+          <w:lang w:val="en-US"/>
+        </w:rPr>
+        <w:t>) ,</w:t>
+      </w:r>
+      <w:proofErr w:type="gramEnd"/>
+      <w:r>
+        <w:rPr>
+          <w:lang w:val="en-US"/>
+        </w:rPr>
+        <w:t xml:space="preserve"> word2.length(</w:t>
+      </w:r>
+      <w:proofErr w:type="gramStart"/>
+      <w:r>
+        <w:rPr>
+          <w:lang w:val="en-US"/>
+        </w:rPr>
+        <w:t>) )</w:t>
+      </w:r>
+      <w:proofErr w:type="gramEnd"/>
+      <w:r>
+        <w:rPr>
+          <w:lang w:val="en-US"/>
+        </w:rPr>
+        <w:t xml:space="preserve"> )</w:t>
+      </w:r>
+    </w:p>
+    <w:p>
+      <w:pPr>
+        <w:rPr>
+          <w:lang w:val="en-US"/>
+        </w:rPr>
+      </w:pPr>
+      <w:r>
+        <w:rPr>
+          <w:lang w:val="en-US"/>
+        </w:rPr>
+        <w:t xml:space="preserve">        </w:t>
+      </w:r>
+      <w:proofErr w:type="gramStart"/>
+      <w:r>
+        <w:rPr>
+          <w:lang w:val="en-US"/>
+        </w:rPr>
+        <w:t>.</w:t>
+      </w:r>
+      <w:proofErr w:type="spellStart"/>
+      <w:r>
+        <w:rPr>
+          <w:lang w:val="en-US"/>
+        </w:rPr>
+        <w:t>orElse</w:t>
+      </w:r>
+      <w:proofErr w:type="spellEnd"/>
+      <w:proofErr w:type="gramEnd"/>
+      <w:r>
+        <w:rPr>
+          <w:lang w:val="en-US"/>
+        </w:rPr>
+        <w:t>(null</w:t>
+      </w:r>
+      <w:proofErr w:type="gramStart"/>
+      <w:r>
+        <w:rPr>
+          <w:lang w:val="en-US"/>
+        </w:rPr>
+        <w:t>) ;</w:t>
+      </w:r>
+      <w:proofErr w:type="gramEnd"/>
+    </w:p>
+    <w:p>
+      <w:pPr>
+        <w:rPr>
+          <w:lang w:val="en-US"/>
+        </w:rPr>
+      </w:pPr>
+    </w:p>
+    <w:p>
+      <w:pPr>
+        <w:rPr>
+          <w:lang w:val="en-US"/>
+        </w:rPr>
+      </w:pPr>
+      <w:r>
+        <w:rPr>
+          <w:lang w:val="en-US"/>
+        </w:rPr>
+        <w:t xml:space="preserve">        </w:t>
+      </w:r>
+      <w:proofErr w:type="spellStart"/>
+      <w:proofErr w:type="gramStart"/>
+      <w:r>
+        <w:rPr>
+          <w:lang w:val="en-US"/>
+        </w:rPr>
+        <w:t>out.println</w:t>
+      </w:r>
+      <w:proofErr w:type="spellEnd"/>
+      <w:proofErr w:type="gramEnd"/>
+      <w:r>
+        <w:rPr>
+          <w:lang w:val="en-US"/>
+        </w:rPr>
+        <w:t>(</w:t>
+      </w:r>
+      <w:proofErr w:type="spellStart"/>
+      <w:r>
+        <w:rPr>
+          <w:lang w:val="en-US"/>
+        </w:rPr>
+        <w:t>ans</w:t>
+      </w:r>
+      <w:proofErr w:type="spellEnd"/>
+      <w:r>
+        <w:rPr>
+          <w:lang w:val="en-US"/>
+        </w:rPr>
+        <w:t>);</w:t>
+      </w:r>
+    </w:p>
+    <w:p>
+      <w:pPr>
+        <w:rPr>
+          <w:lang w:val="en-US"/>
+        </w:rPr>
+      </w:pPr>
+    </w:p>
+    <w:p>
+      <w:pPr>
+        <w:rPr>
+          <w:lang w:val="en-US"/>
+        </w:rPr>
+      </w:pPr>
+      <w:r>
+        <w:rPr>
+          <w:lang w:val="en-US"/>
+        </w:rPr>
+        <w:t xml:space="preserve">OR </w:t>
+      </w:r>
+    </w:p>
+    <w:p>
+      <w:pPr>
+        <w:rPr>
+          <w:lang w:val="en-US"/>
+        </w:rPr>
+      </w:pPr>
+      <w:r>
+        <w:rPr>
+          <w:lang w:val="en-US"/>
+        </w:rPr>
+        <w:t xml:space="preserve">        String </w:t>
+      </w:r>
+      <w:proofErr w:type="spellStart"/>
+      <w:r>
+        <w:rPr>
+          <w:lang w:val="en-US"/>
+        </w:rPr>
+        <w:t>ans</w:t>
+      </w:r>
+      <w:proofErr w:type="spellEnd"/>
+      <w:r>
+        <w:rPr>
+          <w:lang w:val="en-US"/>
+        </w:rPr>
+        <w:t xml:space="preserve"> =</w:t>
+      </w:r>
+    </w:p>
+    <w:p>
+      <w:pPr>
+        <w:rPr>
+          <w:lang w:val="en-US"/>
+        </w:rPr>
+      </w:pPr>
+      <w:r>
+        <w:rPr>
+          <w:lang w:val="en-US"/>
+        </w:rPr>
+        <w:t xml:space="preserve">        words</w:t>
+      </w:r>
+    </w:p>
+    <w:p>
+      <w:pPr>
+        <w:rPr>
+          <w:lang w:val="en-US"/>
+        </w:rPr>
+      </w:pPr>
+      <w:r>
+        <w:rPr>
+          <w:lang w:val="en-US"/>
+        </w:rPr>
+        <w:t xml:space="preserve">        </w:t>
+      </w:r>
+      <w:proofErr w:type="gramStart"/>
+      <w:r>
+        <w:rPr>
+          <w:lang w:val="en-US"/>
+        </w:rPr>
+        <w:t>.stream</w:t>
+      </w:r>
+      <w:proofErr w:type="gramEnd"/>
+      <w:r>
+        <w:rPr>
+          <w:lang w:val="en-US"/>
+        </w:rPr>
+        <w:t>()</w:t>
+      </w:r>
+    </w:p>
+    <w:p>
+      <w:pPr>
+        <w:rPr>
+          <w:lang w:val="en-US"/>
+        </w:rPr>
+      </w:pPr>
+      <w:r>
+        <w:rPr>
+          <w:lang w:val="en-US"/>
+        </w:rPr>
+        <w:t xml:space="preserve">        </w:t>
+      </w:r>
+      <w:proofErr w:type="gramStart"/>
+      <w:r>
+        <w:rPr>
+          <w:lang w:val="en-US"/>
+        </w:rPr>
+        <w:t>.filter( word</w:t>
+      </w:r>
+      <w:proofErr w:type="gramEnd"/>
+      <w:r>
+        <w:rPr>
+          <w:lang w:val="en-US"/>
+        </w:rPr>
+        <w:t xml:space="preserve"> -&gt; </w:t>
+      </w:r>
+      <w:proofErr w:type="spellStart"/>
+      <w:proofErr w:type="gramStart"/>
+      <w:r>
+        <w:rPr>
+          <w:lang w:val="en-US"/>
+        </w:rPr>
+        <w:t>word.chars</w:t>
+      </w:r>
+      <w:proofErr w:type="spellEnd"/>
+      <w:proofErr w:type="gramEnd"/>
+      <w:r>
+        <w:rPr>
+          <w:lang w:val="en-US"/>
+        </w:rPr>
+        <w:t>().</w:t>
+      </w:r>
+    </w:p>
+    <w:p>
+      <w:pPr>
+        <w:rPr>
+          <w:lang w:val="en-US"/>
+        </w:rPr>
+      </w:pPr>
+      <w:r>
+        <w:rPr>
+          <w:lang w:val="en-US"/>
+        </w:rPr>
+        <w:t xml:space="preserve">            </w:t>
+      </w:r>
+      <w:proofErr w:type="spellStart"/>
+      <w:proofErr w:type="gramStart"/>
+      <w:r>
+        <w:rPr>
+          <w:lang w:val="en-US"/>
+        </w:rPr>
+        <w:t>anyMatch</w:t>
+      </w:r>
+      <w:proofErr w:type="spellEnd"/>
+      <w:r>
+        <w:rPr>
+          <w:lang w:val="en-US"/>
+        </w:rPr>
+        <w:t>( ch</w:t>
+      </w:r>
+      <w:proofErr w:type="gramEnd"/>
+      <w:r>
+        <w:rPr>
+          <w:lang w:val="en-US"/>
+        </w:rPr>
+        <w:t xml:space="preserve"> -&gt; </w:t>
+      </w:r>
+      <w:proofErr w:type="spellStart"/>
+      <w:r>
+        <w:rPr>
+          <w:lang w:val="en-US"/>
+        </w:rPr>
+        <w:t>Character.isDigit</w:t>
+      </w:r>
+      <w:proofErr w:type="spellEnd"/>
+      <w:r>
+        <w:rPr>
+          <w:lang w:val="en-US"/>
+        </w:rPr>
+        <w:t>(ch</w:t>
+      </w:r>
+      <w:proofErr w:type="gramStart"/>
+      <w:r>
+        <w:rPr>
+          <w:lang w:val="en-US"/>
+        </w:rPr>
+        <w:t>) )</w:t>
+      </w:r>
+      <w:proofErr w:type="gramEnd"/>
+      <w:r>
+        <w:rPr>
+          <w:lang w:val="en-US"/>
+        </w:rPr>
+        <w:t xml:space="preserve"> == </w:t>
+      </w:r>
+      <w:proofErr w:type="gramStart"/>
+      <w:r>
+        <w:rPr>
+          <w:lang w:val="en-US"/>
+        </w:rPr>
+        <w:t>false )</w:t>
+      </w:r>
+      <w:proofErr w:type="gramEnd"/>
+    </w:p>
+    <w:p>
+      <w:pPr>
+        <w:rPr>
+          <w:lang w:val="en-US"/>
+        </w:rPr>
+      </w:pPr>
+      <w:r>
+        <w:rPr>
+          <w:lang w:val="en-US"/>
+        </w:rPr>
+        <w:t xml:space="preserve">        .</w:t>
+      </w:r>
+      <w:proofErr w:type="gramStart"/>
+      <w:r>
+        <w:rPr>
+          <w:lang w:val="en-US"/>
+        </w:rPr>
+        <w:t>max( (</w:t>
+      </w:r>
+      <w:proofErr w:type="gramEnd"/>
+      <w:r>
+        <w:rPr>
+          <w:lang w:val="en-US"/>
+        </w:rPr>
+        <w:t>word</w:t>
+      </w:r>
+      <w:proofErr w:type="gramStart"/>
+      <w:r>
+        <w:rPr>
+          <w:lang w:val="en-US"/>
+        </w:rPr>
+        <w:t>1,word</w:t>
+      </w:r>
+      <w:proofErr w:type="gramEnd"/>
+      <w:r>
+        <w:rPr>
+          <w:lang w:val="en-US"/>
+        </w:rPr>
+        <w:t xml:space="preserve">2) </w:t>
+      </w:r>
+    </w:p>
+    <w:p>
+      <w:pPr>
+        <w:rPr>
+          <w:lang w:val="en-US"/>
+        </w:rPr>
+      </w:pPr>
+      <w:r>
+        <w:rPr>
+          <w:lang w:val="en-US"/>
+        </w:rPr>
+        <w:t xml:space="preserve">            -&gt; </w:t>
+      </w:r>
+      <w:proofErr w:type="spellStart"/>
+      <w:r>
+        <w:rPr>
+          <w:lang w:val="en-US"/>
+        </w:rPr>
+        <w:t>Integer.compare</w:t>
+      </w:r>
+      <w:proofErr w:type="spellEnd"/>
+      <w:r>
+        <w:rPr>
+          <w:lang w:val="en-US"/>
+        </w:rPr>
+        <w:t>(word1.length(</w:t>
+      </w:r>
+      <w:proofErr w:type="gramStart"/>
+      <w:r>
+        <w:rPr>
+          <w:lang w:val="en-US"/>
+        </w:rPr>
+        <w:t>) ,</w:t>
+      </w:r>
+      <w:proofErr w:type="gramEnd"/>
+      <w:r>
+        <w:rPr>
+          <w:lang w:val="en-US"/>
+        </w:rPr>
+        <w:t xml:space="preserve"> word2.length(</w:t>
+      </w:r>
+      <w:proofErr w:type="gramStart"/>
+      <w:r>
+        <w:rPr>
+          <w:lang w:val="en-US"/>
+        </w:rPr>
+        <w:t>) )</w:t>
+      </w:r>
+      <w:proofErr w:type="gramEnd"/>
+      <w:r>
+        <w:rPr>
+          <w:lang w:val="en-US"/>
+        </w:rPr>
+        <w:t xml:space="preserve"> )</w:t>
+      </w:r>
+    </w:p>
+    <w:p>
+      <w:pPr>
+        <w:rPr>
+          <w:lang w:val="en-US"/>
+        </w:rPr>
+      </w:pPr>
+      <w:r>
+        <w:rPr>
+          <w:lang w:val="en-US"/>
+        </w:rPr>
+        <w:t xml:space="preserve">        </w:t>
+      </w:r>
+      <w:proofErr w:type="gramStart"/>
+      <w:r>
+        <w:rPr>
+          <w:lang w:val="en-US"/>
+        </w:rPr>
+        <w:t>.</w:t>
+      </w:r>
+      <w:proofErr w:type="spellStart"/>
+      <w:r>
+        <w:rPr>
+          <w:lang w:val="en-US"/>
+        </w:rPr>
+        <w:t>orElse</w:t>
+      </w:r>
+      <w:proofErr w:type="spellEnd"/>
+      <w:proofErr w:type="gramEnd"/>
+      <w:r>
+        <w:rPr>
+          <w:lang w:val="en-US"/>
+        </w:rPr>
+        <w:t>(null</w:t>
+      </w:r>
+      <w:proofErr w:type="gramStart"/>
+      <w:r>
+        <w:rPr>
+          <w:lang w:val="en-US"/>
+        </w:rPr>
+        <w:t>) ;</w:t>
+      </w:r>
+      <w:proofErr w:type="gramEnd"/>
+    </w:p>
+    <w:p>
+      <w:pPr>
+        <w:rPr>
+          <w:lang w:val="en-US"/>
+        </w:rPr>
+      </w:pPr>
+    </w:p>
+    <w:p>
+      <w:pPr>
+        <w:rPr>
+          <w:lang w:val="en-US"/>
+        </w:rPr>
+      </w:pPr>
+      <w:r>
+        <w:rPr>
+          <w:lang w:val="en-US"/>
+        </w:rPr>
+        <w:t xml:space="preserve">        </w:t>
+      </w:r>
+      <w:proofErr w:type="spellStart"/>
+      <w:proofErr w:type="gramStart"/>
+      <w:r>
+        <w:rPr>
+          <w:lang w:val="en-US"/>
+        </w:rPr>
+        <w:t>out.println</w:t>
+      </w:r>
+      <w:proofErr w:type="spellEnd"/>
+      <w:proofErr w:type="gramEnd"/>
+      <w:r>
+        <w:rPr>
+          <w:lang w:val="en-US"/>
+        </w:rPr>
+        <w:t>(</w:t>
+      </w:r>
+      <w:proofErr w:type="spellStart"/>
+      <w:r>
+        <w:rPr>
+          <w:lang w:val="en-US"/>
+        </w:rPr>
+        <w:t>ans</w:t>
+      </w:r>
+      <w:proofErr w:type="spellEnd"/>
+      <w:r>
+        <w:rPr>
+          <w:lang w:val="en-US"/>
+        </w:rPr>
+        <w:t>);</w:t>
+      </w:r>
+    </w:p>
+    <w:p>
+      <w:pPr>
+        <w:rPr>
+          <w:lang w:val="en-US"/>
+        </w:rPr>
+      </w:pPr>
+    </w:p>
+    <w:p>
+      <w:pPr>
+        <w:rPr>
+          <w:lang w:val="en-US"/>
+        </w:rPr>
+      </w:pPr>
     </w:p>
     <w:sectPr>
       <w:pgSz w:w="11906" w:h="16838"/>
@@ -16691,7 +18197,7 @@
 </file>
 
 <file path=word/numbering.xml><?xml version="1.0" encoding="utf-8"?>
-<w:numbering xmlns:wpc="http://schemas.microsoft.com/office/word/2010/wordprocessingCanvas" xmlns:cx="http://schemas.microsoft.com/office/drawing/2014/chartex" xmlns:cx1="http://schemas.microsoft.com/office/drawing/2015/9/8/chartex" xmlns:cx2="http://schemas.microsoft.com/office/drawing/2015/10/21/chartex" xmlns:cx3="http://schemas.microsoft.com/office/drawing/2016/5/9/chartex" xmlns:cx4="http://schemas.microsoft.com/office/drawing/2016/5/10/chartex" xmlns:cx5="http://schemas.microsoft.com/office/drawing/2016/5/11/chartex" xmlns:cx6="http://schemas.microsoft.com/office/drawing/2016/5/12/chartex" xmlns:cx7="http://schemas.microsoft.com/office/drawing/2016/5/13/chartex" xmlns:cx8="http://schemas.microsoft.com/office/drawing/2016/5/14/chartex" xmlns:mc="http://schemas.openxmlformats.org/markup-compatibility/2006" xmlns:m="http://schemas.openxmlformats.org/officeDocument/2006/math" xmlns:aink="http://schemas.microsoft.com/office/drawing/2016/ink" xmlns:am3d="http://schemas.microsoft.com/office/drawing/2017/model3d" xmlns:oel="http://schemas.microsoft.com/office/2019/extlst" xmlns:r="http://schemas.openxmlformats.org/officeDocument/2006/relationships" xmlns:wp14="http://schemas.microsoft.com/office/word/2010/wordprocessingDrawing" xmlns:wp="http://schemas.openxmlformats.org/drawingml/2006/wordprocessingDrawing" xmlns:wpg="http://schemas.microsoft.com/office/word/2010/wordprocessingGroup" xmlns:wpi="http://schemas.microsoft.com/office/word/2010/wordprocessingInk" xmlns:wps="http://schemas.microsoft.com/office/word/2010/wordprocessingShape" xmlns:o="urn:schemas-microsoft-com:office:office" xmlns:v="urn:schemas-microsoft-com:vml" xmlns:w10="urn:schemas-microsoft-com:office:word" xmlns:w="http://schemas.openxmlformats.org/wordprocessingml/2006/main" xmlns:w14="http://schemas.microsoft.com/office/word/2010/wordml" xmlns:w15="http://schemas.microsoft.com/office/word/2012/wordml" xmlns:w16cex="http://schemas.microsoft.com/office/word/2018/wordml/cex" xmlns:w16cid="http://schemas.microsoft.com/office/word/2016/wordml/cid" xmlns:w16="http://schemas.microsoft.com/office/word/2018/wordml" xmlns:w16sdtdh="http://schemas.microsoft.com/office/word/2020/wordml/sdtdatahash" xmlns:w16sdtfl="http://schemas.microsoft.com/office/word/2024/wordml/sdtformatlock" xmlns:w16se="http://schemas.microsoft.com/office/word/2015/wordml/symex" xmlns:w16du="http://schemas.microsoft.com/office/word/2023/wordml/word16du" xmlns:wne="http://schemas.microsoft.com/office/word/2006/wordml" mc:Ignorable="w14 w15 w16se w16cid w16 w16cex w16sdtdh w16sdtfl w16du wp14">
+<w:numbering xmlns:wpc="http://schemas.microsoft.com/office/word/2010/wordprocessingCanvas" xmlns:cx="http://schemas.microsoft.com/office/drawing/2014/chartex" xmlns:cx1="http://schemas.microsoft.com/office/drawing/2015/9/8/chartex" xmlns:cx2="http://schemas.microsoft.com/office/drawing/2015/10/21/chartex" xmlns:cx3="http://schemas.microsoft.com/office/drawing/2016/5/9/chartex" xmlns:cx4="http://schemas.microsoft.com/office/drawing/2016/5/10/chartex" xmlns:cx5="http://schemas.microsoft.com/office/drawing/2016/5/11/chartex" xmlns:cx6="http://schemas.microsoft.com/office/drawing/2016/5/12/chartex" xmlns:cx7="http://schemas.microsoft.com/office/drawing/2016/5/13/chartex" xmlns:cx8="http://schemas.microsoft.com/office/drawing/2016/5/14/chartex" xmlns:mc="http://schemas.openxmlformats.org/markup-compatibility/2006" xmlns:aink="http://schemas.microsoft.com/office/drawing/2016/ink" xmlns:am3d="http://schemas.microsoft.com/office/drawing/2017/model3d" xmlns:o="urn:schemas-microsoft-com:office:office" xmlns:oel="http://schemas.microsoft.com/office/2019/extlst" xmlns:r="http://schemas.openxmlformats.org/officeDocument/2006/relationships" xmlns:m="http://schemas.openxmlformats.org/officeDocument/2006/math" xmlns:v="urn:schemas-microsoft-com:vml" xmlns:wp14="http://schemas.microsoft.com/office/word/2010/wordprocessingDrawing" xmlns:wp="http://schemas.openxmlformats.org/drawingml/2006/wordprocessingDrawing" xmlns:w10="urn:schemas-microsoft-com:office:word" xmlns:w="http://schemas.openxmlformats.org/wordprocessingml/2006/main" xmlns:w14="http://schemas.microsoft.com/office/word/2010/wordml" xmlns:w15="http://schemas.microsoft.com/office/word/2012/wordml" xmlns:w16cei="http://schemas.microsoft.com/office/word/2026/wordml/cei" xmlns:w16cex="http://schemas.microsoft.com/office/word/2018/wordml/cex" xmlns:w16cid="http://schemas.microsoft.com/office/word/2016/wordml/cid" xmlns:w16="http://schemas.microsoft.com/office/word/2018/wordml" xmlns:w16du="http://schemas.microsoft.com/office/word/2023/wordml/word16du" xmlns:w16sdtdh="http://schemas.microsoft.com/office/word/2020/wordml/sdtdatahash" xmlns:w16sdtfl="http://schemas.microsoft.com/office/word/2024/wordml/sdtformatlock" xmlns:w16se="http://schemas.microsoft.com/office/word/2015/wordml/symex" xmlns:wpg="http://schemas.microsoft.com/office/word/2010/wordprocessingGroup" xmlns:wpi="http://schemas.microsoft.com/office/word/2010/wordprocessingInk" xmlns:wne="http://schemas.microsoft.com/office/word/2006/wordml" xmlns:wps="http://schemas.microsoft.com/office/word/2010/wordprocessingShape" mc:Ignorable="w14 w15 w16se w16cid w16 w16cex w16sdtdh w16sdtfl w16du wp14">
   <w:abstractNum w:abstractNumId="0" w15:restartNumberingAfterBreak="0">
     <w:nsid w:val="0ED11F8C"/>
     <w:multiLevelType w:val="hybridMultilevel"/>
@@ -17048,7 +18554,7 @@
 </file>
 
 <file path=word/styles.xml><?xml version="1.0" encoding="utf-8"?>
-<w:styles xmlns:mc="http://schemas.openxmlformats.org/markup-compatibility/2006" xmlns:r="http://schemas.openxmlformats.org/officeDocument/2006/relationships" xmlns:w="http://schemas.openxmlformats.org/wordprocessingml/2006/main" xmlns:w14="http://schemas.microsoft.com/office/word/2010/wordml" xmlns:w15="http://schemas.microsoft.com/office/word/2012/wordml" xmlns:w16cex="http://schemas.microsoft.com/office/word/2018/wordml/cex" xmlns:w16cid="http://schemas.microsoft.com/office/word/2016/wordml/cid" xmlns:w16="http://schemas.microsoft.com/office/word/2018/wordml" xmlns:w16sdtdh="http://schemas.microsoft.com/office/word/2020/wordml/sdtdatahash" xmlns:w16sdtfl="http://schemas.microsoft.com/office/word/2024/wordml/sdtformatlock" xmlns:w16se="http://schemas.microsoft.com/office/word/2015/wordml/symex" xmlns:w16du="http://schemas.microsoft.com/office/word/2023/wordml/word16du" mc:Ignorable="w14 w15 w16se w16cid w16 w16cex w16sdtdh w16sdtfl w16du">
+<w:styles xmlns:mc="http://schemas.openxmlformats.org/markup-compatibility/2006" xmlns:r="http://schemas.openxmlformats.org/officeDocument/2006/relationships" xmlns:w="http://schemas.openxmlformats.org/wordprocessingml/2006/main" xmlns:w14="http://schemas.microsoft.com/office/word/2010/wordml" xmlns:w15="http://schemas.microsoft.com/office/word/2012/wordml" xmlns:w16cex="http://schemas.microsoft.com/office/word/2018/wordml/cex" xmlns:w16cid="http://schemas.microsoft.com/office/word/2016/wordml/cid" xmlns:w16="http://schemas.microsoft.com/office/word/2018/wordml" xmlns:w16du="http://schemas.microsoft.com/office/word/2023/wordml/word16du" xmlns:w16sdtdh="http://schemas.microsoft.com/office/word/2020/wordml/sdtdatahash" xmlns:w16sdtfl="http://schemas.microsoft.com/office/word/2024/wordml/sdtformatlock" xmlns:w16se="http://schemas.microsoft.com/office/word/2015/wordml/symex" mc:Ignorable="w14 w15 w16se w16cid w16 w16cex w16sdtdh w16sdtfl w16du">
   <w:docDefaults>
     <w:rPrDefault>
       <w:rPr>
@@ -17523,7 +19029,6 @@
   <w:style w:type="character" w:default="1" w:styleId="DefaultParagraphFont">
     <w:name w:val="Default Paragraph Font"/>
     <w:uiPriority w:val="1"/>
-    <w:semiHidden/>
     <w:unhideWhenUsed/>
   </w:style>
   <w:style w:type="table" w:default="1" w:styleId="TableNormal">

</xml_diff>